<commit_message>
v01.04.01- fix some bugs
</commit_message>
<xml_diff>
--- a/paramgen/docs/parameter_list_user_manual_fa.docx
+++ b/paramgen/docs/parameter_list_user_manual_fa.docx
@@ -27,7 +27,7 @@
           <w:noProof/>
         </w:rPr>
         <w:drawing>
-          <wp:inline distT="0" distB="0" distL="0" distR="0" wp14:anchorId="66225AAC" wp14:editId="4EFD6402">
+          <wp:inline distT="0" distB="0" distL="0" distR="0" wp14:anchorId="02CE8231" wp14:editId="47655636">
             <wp:extent cx="1872000" cy="1130541"/>
             <wp:effectExtent l="0" t="0" r="0" b="0"/>
             <wp:docPr id="30" name="Figure 30"/>
@@ -178,7 +178,7 @@
           <w:szCs w:val="28"/>
           <w:rtl/>
         </w:rPr>
-        <w:t>نسخه‌ی ابزار ۰۱.۰۳.۰۱</w:t>
+        <w:t>نسخه‌ی ابزار ۰۱.۰۴.۰۱</w:t>
       </w:r>
     </w:p>
     <w:p>
@@ -261,7 +261,7 @@
       <w:r>
         <w:fldChar w:fldCharType="separate"/>
       </w:r>
-      <w:hyperlink w:anchor="_Toc244276091" w:history="1">
+      <w:hyperlink w:anchor="_Toc244278098" w:history="1">
         <w:r>
           <w:rPr>
             <w:rStyle w:val="Hyperlink"/>
@@ -314,7 +314,7 @@
             <w:noProof/>
             <w:webHidden/>
           </w:rPr>
-          <w:instrText>Toc244276091 \h</w:instrText>
+          <w:instrText>Toc244278098 \h</w:instrText>
         </w:r>
         <w:r>
           <w:rPr>
@@ -372,7 +372,7 @@
           <w14:ligatures w14:val="standardContextual"/>
         </w:rPr>
       </w:pPr>
-      <w:hyperlink w:anchor="_Toc244276092" w:history="1">
+      <w:hyperlink w:anchor="_Toc244278099" w:history="1">
         <w:r>
           <w:rPr>
             <w:rStyle w:val="Hyperlink"/>
@@ -425,7 +425,7 @@
             <w:noProof/>
             <w:webHidden/>
           </w:rPr>
-          <w:instrText>Toc244276092 \h</w:instrText>
+          <w:instrText>Toc244278099 \h</w:instrText>
         </w:r>
         <w:r>
           <w:rPr>
@@ -483,7 +483,7 @@
           <w14:ligatures w14:val="standardContextual"/>
         </w:rPr>
       </w:pPr>
-      <w:hyperlink w:anchor="_Toc244276093" w:history="1">
+      <w:hyperlink w:anchor="_Toc244278100" w:history="1">
         <w:r>
           <w:rPr>
             <w:rStyle w:val="Hyperlink"/>
@@ -536,7 +536,7 @@
             <w:noProof/>
             <w:webHidden/>
           </w:rPr>
-          <w:instrText>Toc244276093 \h</w:instrText>
+          <w:instrText>Toc244278100 \h</w:instrText>
         </w:r>
         <w:r>
           <w:rPr>
@@ -594,7 +594,7 @@
           <w14:ligatures w14:val="standardContextual"/>
         </w:rPr>
       </w:pPr>
-      <w:hyperlink w:anchor="_Toc244276094" w:history="1">
+      <w:hyperlink w:anchor="_Toc244278101" w:history="1">
         <w:r>
           <w:rPr>
             <w:rStyle w:val="Hyperlink"/>
@@ -647,7 +647,7 @@
             <w:noProof/>
             <w:webHidden/>
           </w:rPr>
-          <w:instrText>Toc244276094 \h</w:instrText>
+          <w:instrText>Toc244278101 \h</w:instrText>
         </w:r>
         <w:r>
           <w:rPr>
@@ -705,7 +705,7 @@
           <w14:ligatures w14:val="standardContextual"/>
         </w:rPr>
       </w:pPr>
-      <w:hyperlink w:anchor="_Toc244276095" w:history="1">
+      <w:hyperlink w:anchor="_Toc244278102" w:history="1">
         <w:r>
           <w:rPr>
             <w:rStyle w:val="Hyperlink"/>
@@ -758,7 +758,7 @@
             <w:noProof/>
             <w:webHidden/>
           </w:rPr>
-          <w:instrText>Toc244276095 \h</w:instrText>
+          <w:instrText>Toc244278102 \h</w:instrText>
         </w:r>
         <w:r>
           <w:rPr>
@@ -818,7 +818,7 @@
           <w14:ligatures w14:val="standardContextual"/>
         </w:rPr>
       </w:pPr>
-      <w:hyperlink w:anchor="_Toc244276096" w:history="1">
+      <w:hyperlink w:anchor="_Toc244278103" w:history="1">
         <w:r>
           <w:rPr>
             <w:rStyle w:val="Hyperlink"/>
@@ -871,7 +871,7 @@
             <w:noProof/>
             <w:webHidden/>
           </w:rPr>
-          <w:instrText>Toc244276096 \h</w:instrText>
+          <w:instrText>Toc244278103 \h</w:instrText>
         </w:r>
         <w:r>
           <w:rPr>
@@ -929,7 +929,7 @@
           <w14:ligatures w14:val="standardContextual"/>
         </w:rPr>
       </w:pPr>
-      <w:hyperlink w:anchor="_Toc244276097" w:history="1">
+      <w:hyperlink w:anchor="_Toc244278104" w:history="1">
         <w:r>
           <w:rPr>
             <w:rStyle w:val="Hyperlink"/>
@@ -982,7 +982,7 @@
             <w:noProof/>
             <w:webHidden/>
           </w:rPr>
-          <w:instrText>Toc244276097 \h</w:instrText>
+          <w:instrText>Toc244278104 \h</w:instrText>
         </w:r>
         <w:r>
           <w:rPr>
@@ -1040,7 +1040,7 @@
           <w14:ligatures w14:val="standardContextual"/>
         </w:rPr>
       </w:pPr>
-      <w:hyperlink w:anchor="_Toc244276098" w:history="1">
+      <w:hyperlink w:anchor="_Toc244278105" w:history="1">
         <w:r>
           <w:rPr>
             <w:rStyle w:val="Hyperlink"/>
@@ -1093,7 +1093,7 @@
             <w:noProof/>
             <w:webHidden/>
           </w:rPr>
-          <w:instrText>Toc244276098 \h</w:instrText>
+          <w:instrText>Toc244278105 \h</w:instrText>
         </w:r>
         <w:r>
           <w:rPr>
@@ -1151,7 +1151,7 @@
           <w14:ligatures w14:val="standardContextual"/>
         </w:rPr>
       </w:pPr>
-      <w:hyperlink w:anchor="_Toc244276099" w:history="1">
+      <w:hyperlink w:anchor="_Toc244278106" w:history="1">
         <w:r>
           <w:rPr>
             <w:rStyle w:val="Hyperlink"/>
@@ -1204,7 +1204,7 @@
             <w:noProof/>
             <w:webHidden/>
           </w:rPr>
-          <w:instrText>Toc244276099 \h</w:instrText>
+          <w:instrText>Toc244278106 \h</w:instrText>
         </w:r>
         <w:r>
           <w:rPr>
@@ -1262,7 +1262,7 @@
           <w14:ligatures w14:val="standardContextual"/>
         </w:rPr>
       </w:pPr>
-      <w:hyperlink w:anchor="_Toc244276100" w:history="1">
+      <w:hyperlink w:anchor="_Toc244278107" w:history="1">
         <w:r>
           <w:rPr>
             <w:rStyle w:val="Hyperlink"/>
@@ -1315,7 +1315,7 @@
             <w:noProof/>
             <w:webHidden/>
           </w:rPr>
-          <w:instrText>Toc244276100 \h</w:instrText>
+          <w:instrText>Toc244278107 \h</w:instrText>
         </w:r>
         <w:r>
           <w:rPr>
@@ -1373,7 +1373,7 @@
           <w14:ligatures w14:val="standardContextual"/>
         </w:rPr>
       </w:pPr>
-      <w:hyperlink w:anchor="_Toc244276101" w:history="1">
+      <w:hyperlink w:anchor="_Toc244278108" w:history="1">
         <w:r>
           <w:rPr>
             <w:rStyle w:val="Hyperlink"/>
@@ -1426,7 +1426,7 @@
             <w:noProof/>
             <w:webHidden/>
           </w:rPr>
-          <w:instrText>Toc244276101 \h</w:instrText>
+          <w:instrText>Toc244278108 \h</w:instrText>
         </w:r>
         <w:r>
           <w:rPr>
@@ -1484,7 +1484,7 @@
           <w14:ligatures w14:val="standardContextual"/>
         </w:rPr>
       </w:pPr>
-      <w:hyperlink w:anchor="_Toc244276102" w:history="1">
+      <w:hyperlink w:anchor="_Toc244278109" w:history="1">
         <w:r>
           <w:rPr>
             <w:rStyle w:val="Hyperlink"/>
@@ -1537,7 +1537,7 @@
             <w:noProof/>
             <w:webHidden/>
           </w:rPr>
-          <w:instrText>Toc244276102 \h</w:instrText>
+          <w:instrText>Toc244278109 \h</w:instrText>
         </w:r>
         <w:r>
           <w:rPr>
@@ -1595,7 +1595,7 @@
           <w14:ligatures w14:val="standardContextual"/>
         </w:rPr>
       </w:pPr>
-      <w:hyperlink w:anchor="_Toc244276103" w:history="1">
+      <w:hyperlink w:anchor="_Toc244278110" w:history="1">
         <w:r>
           <w:rPr>
             <w:rStyle w:val="Hyperlink"/>
@@ -1648,7 +1648,7 @@
             <w:noProof/>
             <w:webHidden/>
           </w:rPr>
-          <w:instrText>Toc244276103 \h</w:instrText>
+          <w:instrText>Toc244278110 \h</w:instrText>
         </w:r>
         <w:r>
           <w:rPr>
@@ -1706,7 +1706,7 @@
           <w14:ligatures w14:val="standardContextual"/>
         </w:rPr>
       </w:pPr>
-      <w:hyperlink w:anchor="_Toc244276104" w:history="1">
+      <w:hyperlink w:anchor="_Toc244278111" w:history="1">
         <w:r>
           <w:rPr>
             <w:rStyle w:val="Hyperlink"/>
@@ -1759,7 +1759,7 @@
             <w:noProof/>
             <w:webHidden/>
           </w:rPr>
-          <w:instrText>Toc244276104 \h</w:instrText>
+          <w:instrText>Toc244278111 \h</w:instrText>
         </w:r>
         <w:r>
           <w:rPr>
@@ -1817,7 +1817,7 @@
           <w14:ligatures w14:val="standardContextual"/>
         </w:rPr>
       </w:pPr>
-      <w:hyperlink w:anchor="_Toc244276105" w:history="1">
+      <w:hyperlink w:anchor="_Toc244278112" w:history="1">
         <w:r>
           <w:rPr>
             <w:rStyle w:val="Hyperlink"/>
@@ -1870,7 +1870,7 @@
             <w:noProof/>
             <w:webHidden/>
           </w:rPr>
-          <w:instrText>Toc244276105 \h</w:instrText>
+          <w:instrText>Toc244278112 \h</w:instrText>
         </w:r>
         <w:r>
           <w:rPr>
@@ -1930,7 +1930,7 @@
           <w14:ligatures w14:val="standardContextual"/>
         </w:rPr>
       </w:pPr>
-      <w:hyperlink w:anchor="_Toc244276106" w:history="1">
+      <w:hyperlink w:anchor="_Toc244278113" w:history="1">
         <w:r>
           <w:rPr>
             <w:rStyle w:val="Hyperlink"/>
@@ -1983,7 +1983,7 @@
             <w:noProof/>
             <w:webHidden/>
           </w:rPr>
-          <w:instrText>Toc244276106 \h</w:instrText>
+          <w:instrText>Toc244278113 \h</w:instrText>
         </w:r>
         <w:r>
           <w:rPr>
@@ -2041,7 +2041,7 @@
           <w14:ligatures w14:val="standardContextual"/>
         </w:rPr>
       </w:pPr>
-      <w:hyperlink w:anchor="_Toc244276107" w:history="1">
+      <w:hyperlink w:anchor="_Toc244278114" w:history="1">
         <w:r>
           <w:rPr>
             <w:rStyle w:val="Hyperlink"/>
@@ -2094,7 +2094,7 @@
             <w:noProof/>
             <w:webHidden/>
           </w:rPr>
-          <w:instrText>Toc244276107 \h</w:instrText>
+          <w:instrText>Toc244278114 \h</w:instrText>
         </w:r>
         <w:r>
           <w:rPr>
@@ -2152,7 +2152,7 @@
           <w14:ligatures w14:val="standardContextual"/>
         </w:rPr>
       </w:pPr>
-      <w:hyperlink w:anchor="_Toc244276108" w:history="1">
+      <w:hyperlink w:anchor="_Toc244278115" w:history="1">
         <w:r>
           <w:rPr>
             <w:rStyle w:val="Hyperlink"/>
@@ -2205,7 +2205,7 @@
             <w:noProof/>
             <w:webHidden/>
           </w:rPr>
-          <w:instrText>Toc244276108 \h</w:instrText>
+          <w:instrText>Toc244278115 \h</w:instrText>
         </w:r>
         <w:r>
           <w:rPr>
@@ -2263,7 +2263,7 @@
           <w14:ligatures w14:val="standardContextual"/>
         </w:rPr>
       </w:pPr>
-      <w:hyperlink w:anchor="_Toc244276109" w:history="1">
+      <w:hyperlink w:anchor="_Toc244278116" w:history="1">
         <w:r>
           <w:rPr>
             <w:rStyle w:val="Hyperlink"/>
@@ -2316,7 +2316,7 @@
             <w:noProof/>
             <w:webHidden/>
           </w:rPr>
-          <w:instrText>Toc244276109 \h</w:instrText>
+          <w:instrText>Toc244278116 \h</w:instrText>
         </w:r>
         <w:r>
           <w:rPr>
@@ -2374,7 +2374,7 @@
           <w14:ligatures w14:val="standardContextual"/>
         </w:rPr>
       </w:pPr>
-      <w:hyperlink w:anchor="_Toc244276110" w:history="1">
+      <w:hyperlink w:anchor="_Toc244278117" w:history="1">
         <w:r>
           <w:rPr>
             <w:rStyle w:val="Hyperlink"/>
@@ -2427,7 +2427,7 @@
             <w:noProof/>
             <w:webHidden/>
           </w:rPr>
-          <w:instrText>Toc244276110 \h</w:instrText>
+          <w:instrText>Toc244278117 \h</w:instrText>
         </w:r>
         <w:r>
           <w:rPr>
@@ -2485,7 +2485,7 @@
           <w14:ligatures w14:val="standardContextual"/>
         </w:rPr>
       </w:pPr>
-      <w:hyperlink w:anchor="_Toc244276111" w:history="1">
+      <w:hyperlink w:anchor="_Toc244278118" w:history="1">
         <w:r>
           <w:rPr>
             <w:rStyle w:val="Hyperlink"/>
@@ -2538,7 +2538,7 @@
             <w:noProof/>
             <w:webHidden/>
           </w:rPr>
-          <w:instrText>Toc244276111 \h</w:instrText>
+          <w:instrText>Toc244278118 \h</w:instrText>
         </w:r>
         <w:r>
           <w:rPr>
@@ -2596,7 +2596,7 @@
           <w14:ligatures w14:val="standardContextual"/>
         </w:rPr>
       </w:pPr>
-      <w:hyperlink w:anchor="_Toc244276112" w:history="1">
+      <w:hyperlink w:anchor="_Toc244278119" w:history="1">
         <w:r>
           <w:rPr>
             <w:rStyle w:val="Hyperlink"/>
@@ -2649,7 +2649,7 @@
             <w:noProof/>
             <w:webHidden/>
           </w:rPr>
-          <w:instrText>Toc244276112 \h</w:instrText>
+          <w:instrText>Toc244278119 \h</w:instrText>
         </w:r>
         <w:r>
           <w:rPr>
@@ -2709,7 +2709,7 @@
           <w14:ligatures w14:val="standardContextual"/>
         </w:rPr>
       </w:pPr>
-      <w:hyperlink w:anchor="_Toc244276113" w:history="1">
+      <w:hyperlink w:anchor="_Toc244278120" w:history="1">
         <w:r>
           <w:rPr>
             <w:rStyle w:val="Hyperlink"/>
@@ -2769,7 +2769,7 @@
             <w:noProof/>
             <w:webHidden/>
           </w:rPr>
-          <w:instrText>Toc244276113 \h</w:instrText>
+          <w:instrText>Toc244278120 \h</w:instrText>
         </w:r>
         <w:r>
           <w:rPr>
@@ -2829,7 +2829,7 @@
           <w14:ligatures w14:val="standardContextual"/>
         </w:rPr>
       </w:pPr>
-      <w:hyperlink w:anchor="_Toc244276114" w:history="1">
+      <w:hyperlink w:anchor="_Toc244278121" w:history="1">
         <w:r>
           <w:rPr>
             <w:rStyle w:val="Hyperlink"/>
@@ -2882,7 +2882,7 @@
             <w:noProof/>
             <w:webHidden/>
           </w:rPr>
-          <w:instrText>Toc244276114 \h</w:instrText>
+          <w:instrText>Toc244278121 \h</w:instrText>
         </w:r>
         <w:r>
           <w:rPr>
@@ -2940,7 +2940,7 @@
           <w14:ligatures w14:val="standardContextual"/>
         </w:rPr>
       </w:pPr>
-      <w:hyperlink w:anchor="_Toc244276115" w:history="1">
+      <w:hyperlink w:anchor="_Toc244278122" w:history="1">
         <w:r>
           <w:rPr>
             <w:rStyle w:val="Hyperlink"/>
@@ -2993,7 +2993,7 @@
             <w:noProof/>
             <w:webHidden/>
           </w:rPr>
-          <w:instrText>Toc244276115 \h</w:instrText>
+          <w:instrText>Toc244278122 \h</w:instrText>
         </w:r>
         <w:r>
           <w:rPr>
@@ -3051,7 +3051,7 @@
           <w14:ligatures w14:val="standardContextual"/>
         </w:rPr>
       </w:pPr>
-      <w:hyperlink w:anchor="_Toc244276116" w:history="1">
+      <w:hyperlink w:anchor="_Toc244278123" w:history="1">
         <w:r>
           <w:rPr>
             <w:rStyle w:val="Hyperlink"/>
@@ -3104,7 +3104,7 @@
             <w:noProof/>
             <w:webHidden/>
           </w:rPr>
-          <w:instrText>Toc244276116 \h</w:instrText>
+          <w:instrText>Toc244278123 \h</w:instrText>
         </w:r>
         <w:r>
           <w:rPr>
@@ -3162,7 +3162,7 @@
           <w14:ligatures w14:val="standardContextual"/>
         </w:rPr>
       </w:pPr>
-      <w:hyperlink w:anchor="_Toc244276117" w:history="1">
+      <w:hyperlink w:anchor="_Toc244278124" w:history="1">
         <w:r>
           <w:rPr>
             <w:rStyle w:val="Hyperlink"/>
@@ -3215,7 +3215,7 @@
             <w:noProof/>
             <w:webHidden/>
           </w:rPr>
-          <w:instrText>Toc244276117 \h</w:instrText>
+          <w:instrText>Toc244278124 \h</w:instrText>
         </w:r>
         <w:r>
           <w:rPr>
@@ -3273,7 +3273,7 @@
           <w14:ligatures w14:val="standardContextual"/>
         </w:rPr>
       </w:pPr>
-      <w:hyperlink w:anchor="_Toc244276118" w:history="1">
+      <w:hyperlink w:anchor="_Toc244278125" w:history="1">
         <w:r>
           <w:rPr>
             <w:rStyle w:val="Hyperlink"/>
@@ -3326,7 +3326,7 @@
             <w:noProof/>
             <w:webHidden/>
           </w:rPr>
-          <w:instrText>Toc244276118 \h</w:instrText>
+          <w:instrText>Toc244278125 \h</w:instrText>
         </w:r>
         <w:r>
           <w:rPr>
@@ -3384,7 +3384,7 @@
           <w14:ligatures w14:val="standardContextual"/>
         </w:rPr>
       </w:pPr>
-      <w:hyperlink w:anchor="_Toc244276119" w:history="1">
+      <w:hyperlink w:anchor="_Toc244278126" w:history="1">
         <w:r>
           <w:rPr>
             <w:rStyle w:val="Hyperlink"/>
@@ -3437,7 +3437,7 @@
             <w:noProof/>
             <w:webHidden/>
           </w:rPr>
-          <w:instrText>Toc244276119 \h</w:instrText>
+          <w:instrText>Toc244278126 \h</w:instrText>
         </w:r>
         <w:r>
           <w:rPr>
@@ -3497,7 +3497,7 @@
           <w14:ligatures w14:val="standardContextual"/>
         </w:rPr>
       </w:pPr>
-      <w:hyperlink w:anchor="_Toc244276120" w:history="1">
+      <w:hyperlink w:anchor="_Toc244278127" w:history="1">
         <w:r>
           <w:rPr>
             <w:rStyle w:val="Hyperlink"/>
@@ -3550,7 +3550,7 @@
             <w:noProof/>
             <w:webHidden/>
           </w:rPr>
-          <w:instrText>Toc244276120 \h</w:instrText>
+          <w:instrText>Toc244278127 \h</w:instrText>
         </w:r>
         <w:r>
           <w:rPr>
@@ -3608,7 +3608,7 @@
           <w14:ligatures w14:val="standardContextual"/>
         </w:rPr>
       </w:pPr>
-      <w:hyperlink w:anchor="_Toc244276121" w:history="1">
+      <w:hyperlink w:anchor="_Toc244278128" w:history="1">
         <w:r>
           <w:rPr>
             <w:rStyle w:val="Hyperlink"/>
@@ -3661,7 +3661,7 @@
             <w:noProof/>
             <w:webHidden/>
           </w:rPr>
-          <w:instrText>Toc244276121 \h</w:instrText>
+          <w:instrText>Toc244278128 \h</w:instrText>
         </w:r>
         <w:r>
           <w:rPr>
@@ -3719,7 +3719,7 @@
           <w14:ligatures w14:val="standardContextual"/>
         </w:rPr>
       </w:pPr>
-      <w:hyperlink w:anchor="_Toc244276122" w:history="1">
+      <w:hyperlink w:anchor="_Toc244278129" w:history="1">
         <w:r>
           <w:rPr>
             <w:rStyle w:val="Hyperlink"/>
@@ -3772,7 +3772,7 @@
             <w:noProof/>
             <w:webHidden/>
           </w:rPr>
-          <w:instrText>Toc244276122 \h</w:instrText>
+          <w:instrText>Toc244278129 \h</w:instrText>
         </w:r>
         <w:r>
           <w:rPr>
@@ -3830,7 +3830,7 @@
           <w14:ligatures w14:val="standardContextual"/>
         </w:rPr>
       </w:pPr>
-      <w:hyperlink w:anchor="_Toc244276123" w:history="1">
+      <w:hyperlink w:anchor="_Toc244278130" w:history="1">
         <w:r>
           <w:rPr>
             <w:rStyle w:val="Hyperlink"/>
@@ -3883,7 +3883,7 @@
             <w:noProof/>
             <w:webHidden/>
           </w:rPr>
-          <w:instrText>Toc244276123 \h</w:instrText>
+          <w:instrText>Toc244278130 \h</w:instrText>
         </w:r>
         <w:r>
           <w:rPr>
@@ -3941,7 +3941,7 @@
           <w14:ligatures w14:val="standardContextual"/>
         </w:rPr>
       </w:pPr>
-      <w:hyperlink w:anchor="_Toc244276124" w:history="1">
+      <w:hyperlink w:anchor="_Toc244278131" w:history="1">
         <w:r>
           <w:rPr>
             <w:rStyle w:val="Hyperlink"/>
@@ -4009,7 +4009,7 @@
             <w:noProof/>
             <w:webHidden/>
           </w:rPr>
-          <w:instrText>Toc244276124 \h</w:instrText>
+          <w:instrText>Toc244278131 \h</w:instrText>
         </w:r>
         <w:r>
           <w:rPr>
@@ -4067,7 +4067,7 @@
           <w14:ligatures w14:val="standardContextual"/>
         </w:rPr>
       </w:pPr>
-      <w:hyperlink w:anchor="_Toc244276125" w:history="1">
+      <w:hyperlink w:anchor="_Toc244278132" w:history="1">
         <w:r>
           <w:rPr>
             <w:rStyle w:val="Hyperlink"/>
@@ -4120,7 +4120,7 @@
             <w:noProof/>
             <w:webHidden/>
           </w:rPr>
-          <w:instrText>Toc244276125 \h</w:instrText>
+          <w:instrText>Toc244278132 \h</w:instrText>
         </w:r>
         <w:r>
           <w:rPr>
@@ -4180,7 +4180,7 @@
           <w14:ligatures w14:val="standardContextual"/>
         </w:rPr>
       </w:pPr>
-      <w:hyperlink w:anchor="_Toc244276126" w:history="1">
+      <w:hyperlink w:anchor="_Toc244278133" w:history="1">
         <w:r>
           <w:rPr>
             <w:rStyle w:val="Hyperlink"/>
@@ -4233,7 +4233,7 @@
             <w:noProof/>
             <w:webHidden/>
           </w:rPr>
-          <w:instrText>Toc244276126 \h</w:instrText>
+          <w:instrText>Toc244278133 \h</w:instrText>
         </w:r>
         <w:r>
           <w:rPr>
@@ -4291,7 +4291,7 @@
           <w14:ligatures w14:val="standardContextual"/>
         </w:rPr>
       </w:pPr>
-      <w:hyperlink w:anchor="_Toc244276127" w:history="1">
+      <w:hyperlink w:anchor="_Toc244278134" w:history="1">
         <w:r>
           <w:rPr>
             <w:rStyle w:val="Hyperlink"/>
@@ -4344,7 +4344,7 @@
             <w:noProof/>
             <w:webHidden/>
           </w:rPr>
-          <w:instrText>Toc244276127 \h</w:instrText>
+          <w:instrText>Toc244278134 \h</w:instrText>
         </w:r>
         <w:r>
           <w:rPr>
@@ -4402,7 +4402,7 @@
           <w14:ligatures w14:val="standardContextual"/>
         </w:rPr>
       </w:pPr>
-      <w:hyperlink w:anchor="_Toc244276128" w:history="1">
+      <w:hyperlink w:anchor="_Toc244278135" w:history="1">
         <w:r>
           <w:rPr>
             <w:rStyle w:val="Hyperlink"/>
@@ -4455,7 +4455,7 @@
             <w:noProof/>
             <w:webHidden/>
           </w:rPr>
-          <w:instrText>Toc244276128 \h</w:instrText>
+          <w:instrText>Toc244278135 \h</w:instrText>
         </w:r>
         <w:r>
           <w:rPr>
@@ -4513,7 +4513,7 @@
           <w14:ligatures w14:val="standardContextual"/>
         </w:rPr>
       </w:pPr>
-      <w:hyperlink w:anchor="_Toc244276129" w:history="1">
+      <w:hyperlink w:anchor="_Toc244278136" w:history="1">
         <w:r>
           <w:rPr>
             <w:rStyle w:val="Hyperlink"/>
@@ -4566,7 +4566,7 @@
             <w:noProof/>
             <w:webHidden/>
           </w:rPr>
-          <w:instrText>Toc244276129 \h</w:instrText>
+          <w:instrText>Toc244278136 \h</w:instrText>
         </w:r>
         <w:r>
           <w:rPr>
@@ -4624,7 +4624,7 @@
           <w14:ligatures w14:val="standardContextual"/>
         </w:rPr>
       </w:pPr>
-      <w:hyperlink w:anchor="_Toc244276130" w:history="1">
+      <w:hyperlink w:anchor="_Toc244278137" w:history="1">
         <w:r>
           <w:rPr>
             <w:rStyle w:val="Hyperlink"/>
@@ -4677,7 +4677,7 @@
             <w:noProof/>
             <w:webHidden/>
           </w:rPr>
-          <w:instrText>Toc244276130 \h</w:instrText>
+          <w:instrText>Toc244278137 \h</w:instrText>
         </w:r>
         <w:r>
           <w:rPr>
@@ -4735,7 +4735,7 @@
           <w14:ligatures w14:val="standardContextual"/>
         </w:rPr>
       </w:pPr>
-      <w:hyperlink w:anchor="_Toc244276131" w:history="1">
+      <w:hyperlink w:anchor="_Toc244278138" w:history="1">
         <w:r>
           <w:rPr>
             <w:rStyle w:val="Hyperlink"/>
@@ -4788,7 +4788,7 @@
             <w:noProof/>
             <w:webHidden/>
           </w:rPr>
-          <w:instrText>Toc244276131 \h</w:instrText>
+          <w:instrText>Toc244278138 \h</w:instrText>
         </w:r>
         <w:r>
           <w:rPr>
@@ -4846,7 +4846,7 @@
           <w14:ligatures w14:val="standardContextual"/>
         </w:rPr>
       </w:pPr>
-      <w:hyperlink w:anchor="_Toc244276132" w:history="1">
+      <w:hyperlink w:anchor="_Toc244278139" w:history="1">
         <w:r>
           <w:rPr>
             <w:rStyle w:val="Hyperlink"/>
@@ -4899,7 +4899,7 @@
             <w:noProof/>
             <w:webHidden/>
           </w:rPr>
-          <w:instrText>Toc244276132 \h</w:instrText>
+          <w:instrText>Toc244278139 \h</w:instrText>
         </w:r>
         <w:r>
           <w:rPr>
@@ -4957,7 +4957,7 @@
           <w14:ligatures w14:val="standardContextual"/>
         </w:rPr>
       </w:pPr>
-      <w:hyperlink w:anchor="_Toc244276133" w:history="1">
+      <w:hyperlink w:anchor="_Toc244278140" w:history="1">
         <w:r>
           <w:rPr>
             <w:rStyle w:val="Hyperlink"/>
@@ -5010,7 +5010,7 @@
             <w:noProof/>
             <w:webHidden/>
           </w:rPr>
-          <w:instrText>Toc244276133 \h</w:instrText>
+          <w:instrText>Toc244278140 \h</w:instrText>
         </w:r>
         <w:r>
           <w:rPr>
@@ -5068,7 +5068,7 @@
           <w14:ligatures w14:val="standardContextual"/>
         </w:rPr>
       </w:pPr>
-      <w:hyperlink w:anchor="_Toc244276134" w:history="1">
+      <w:hyperlink w:anchor="_Toc244278141" w:history="1">
         <w:r>
           <w:rPr>
             <w:rStyle w:val="Hyperlink"/>
@@ -5121,7 +5121,7 @@
             <w:noProof/>
             <w:webHidden/>
           </w:rPr>
-          <w:instrText>Toc244276134 \h</w:instrText>
+          <w:instrText>Toc244278141 \h</w:instrText>
         </w:r>
         <w:r>
           <w:rPr>
@@ -5181,7 +5181,7 @@
           <w14:ligatures w14:val="standardContextual"/>
         </w:rPr>
       </w:pPr>
-      <w:hyperlink w:anchor="_Toc244276135" w:history="1">
+      <w:hyperlink w:anchor="_Toc244278142" w:history="1">
         <w:r>
           <w:rPr>
             <w:rStyle w:val="Hyperlink"/>
@@ -5234,7 +5234,7 @@
             <w:noProof/>
             <w:webHidden/>
           </w:rPr>
-          <w:instrText>Toc244276135 \h</w:instrText>
+          <w:instrText>Toc244278142 \h</w:instrText>
         </w:r>
         <w:r>
           <w:rPr>
@@ -5292,7 +5292,7 @@
           <w14:ligatures w14:val="standardContextual"/>
         </w:rPr>
       </w:pPr>
-      <w:hyperlink w:anchor="_Toc244276136" w:history="1">
+      <w:hyperlink w:anchor="_Toc244278143" w:history="1">
         <w:r>
           <w:rPr>
             <w:rStyle w:val="Hyperlink"/>
@@ -5345,7 +5345,7 @@
             <w:noProof/>
             <w:webHidden/>
           </w:rPr>
-          <w:instrText>Toc244276136 \h</w:instrText>
+          <w:instrText>Toc244278143 \h</w:instrText>
         </w:r>
         <w:r>
           <w:rPr>
@@ -5403,7 +5403,7 @@
           <w14:ligatures w14:val="standardContextual"/>
         </w:rPr>
       </w:pPr>
-      <w:hyperlink w:anchor="_Toc244276137" w:history="1">
+      <w:hyperlink w:anchor="_Toc244278144" w:history="1">
         <w:r>
           <w:rPr>
             <w:rStyle w:val="Hyperlink"/>
@@ -5456,7 +5456,7 @@
             <w:noProof/>
             <w:webHidden/>
           </w:rPr>
-          <w:instrText>Toc244276137 \h</w:instrText>
+          <w:instrText>Toc244278144 \h</w:instrText>
         </w:r>
         <w:r>
           <w:rPr>
@@ -5514,7 +5514,7 @@
           <w14:ligatures w14:val="standardContextual"/>
         </w:rPr>
       </w:pPr>
-      <w:hyperlink w:anchor="_Toc244276138" w:history="1">
+      <w:hyperlink w:anchor="_Toc244278145" w:history="1">
         <w:r>
           <w:rPr>
             <w:rStyle w:val="Hyperlink"/>
@@ -5567,7 +5567,7 @@
             <w:noProof/>
             <w:webHidden/>
           </w:rPr>
-          <w:instrText>Toc244276138 \h</w:instrText>
+          <w:instrText>Toc244278145 \h</w:instrText>
         </w:r>
         <w:r>
           <w:rPr>
@@ -5625,7 +5625,7 @@
           <w14:ligatures w14:val="standardContextual"/>
         </w:rPr>
       </w:pPr>
-      <w:hyperlink w:anchor="_Toc244276139" w:history="1">
+      <w:hyperlink w:anchor="_Toc244278146" w:history="1">
         <w:r>
           <w:rPr>
             <w:rStyle w:val="Hyperlink"/>
@@ -5678,7 +5678,7 @@
             <w:noProof/>
             <w:webHidden/>
           </w:rPr>
-          <w:instrText>Toc244276139 \h</w:instrText>
+          <w:instrText>Toc244278146 \h</w:instrText>
         </w:r>
         <w:r>
           <w:rPr>
@@ -5736,7 +5736,7 @@
           <w14:ligatures w14:val="standardContextual"/>
         </w:rPr>
       </w:pPr>
-      <w:hyperlink w:anchor="_Toc244276140" w:history="1">
+      <w:hyperlink w:anchor="_Toc244278147" w:history="1">
         <w:r>
           <w:rPr>
             <w:rStyle w:val="Hyperlink"/>
@@ -5789,7 +5789,7 @@
             <w:noProof/>
             <w:webHidden/>
           </w:rPr>
-          <w:instrText>Toc244276140 \h</w:instrText>
+          <w:instrText>Toc244278147 \h</w:instrText>
         </w:r>
         <w:r>
           <w:rPr>
@@ -5847,7 +5847,7 @@
           <w14:ligatures w14:val="standardContextual"/>
         </w:rPr>
       </w:pPr>
-      <w:hyperlink w:anchor="_Toc244276141" w:history="1">
+      <w:hyperlink w:anchor="_Toc244278148" w:history="1">
         <w:r>
           <w:rPr>
             <w:rStyle w:val="Hyperlink"/>
@@ -5900,7 +5900,7 @@
             <w:noProof/>
             <w:webHidden/>
           </w:rPr>
-          <w:instrText>Toc244276141 \h</w:instrText>
+          <w:instrText>Toc244278148 \h</w:instrText>
         </w:r>
         <w:r>
           <w:rPr>
@@ -5960,7 +5960,7 @@
           <w14:ligatures w14:val="standardContextual"/>
         </w:rPr>
       </w:pPr>
-      <w:hyperlink w:anchor="_Toc244276142" w:history="1">
+      <w:hyperlink w:anchor="_Toc244278149" w:history="1">
         <w:r>
           <w:rPr>
             <w:rStyle w:val="Hyperlink"/>
@@ -6013,7 +6013,7 @@
             <w:noProof/>
             <w:webHidden/>
           </w:rPr>
-          <w:instrText>Toc244276142 \h</w:instrText>
+          <w:instrText>Toc244278149 \h</w:instrText>
         </w:r>
         <w:r>
           <w:rPr>
@@ -6071,7 +6071,7 @@
           <w14:ligatures w14:val="standardContextual"/>
         </w:rPr>
       </w:pPr>
-      <w:hyperlink w:anchor="_Toc244276143" w:history="1">
+      <w:hyperlink w:anchor="_Toc244278150" w:history="1">
         <w:r>
           <w:rPr>
             <w:rStyle w:val="Hyperlink"/>
@@ -6124,7 +6124,7 @@
             <w:noProof/>
             <w:webHidden/>
           </w:rPr>
-          <w:instrText>Toc244276143 \h</w:instrText>
+          <w:instrText>Toc244278150 \h</w:instrText>
         </w:r>
         <w:r>
           <w:rPr>
@@ -6182,7 +6182,7 @@
           <w14:ligatures w14:val="standardContextual"/>
         </w:rPr>
       </w:pPr>
-      <w:hyperlink w:anchor="_Toc244276144" w:history="1">
+      <w:hyperlink w:anchor="_Toc244278151" w:history="1">
         <w:r>
           <w:rPr>
             <w:rStyle w:val="Hyperlink"/>
@@ -6235,7 +6235,7 @@
             <w:noProof/>
             <w:webHidden/>
           </w:rPr>
-          <w:instrText>Toc244276144 \h</w:instrText>
+          <w:instrText>Toc244278151 \h</w:instrText>
         </w:r>
         <w:r>
           <w:rPr>
@@ -6293,7 +6293,7 @@
           <w14:ligatures w14:val="standardContextual"/>
         </w:rPr>
       </w:pPr>
-      <w:hyperlink w:anchor="_Toc244276145" w:history="1">
+      <w:hyperlink w:anchor="_Toc244278152" w:history="1">
         <w:r>
           <w:rPr>
             <w:rStyle w:val="Hyperlink"/>
@@ -6346,7 +6346,7 @@
             <w:noProof/>
             <w:webHidden/>
           </w:rPr>
-          <w:instrText>Toc244276145 \h</w:instrText>
+          <w:instrText>Toc244278152 \h</w:instrText>
         </w:r>
         <w:r>
           <w:rPr>
@@ -6404,7 +6404,7 @@
           <w14:ligatures w14:val="standardContextual"/>
         </w:rPr>
       </w:pPr>
-      <w:hyperlink w:anchor="_Toc244276146" w:history="1">
+      <w:hyperlink w:anchor="_Toc244278153" w:history="1">
         <w:r>
           <w:rPr>
             <w:rStyle w:val="Hyperlink"/>
@@ -6457,7 +6457,7 @@
             <w:noProof/>
             <w:webHidden/>
           </w:rPr>
-          <w:instrText>Toc244276146 \h</w:instrText>
+          <w:instrText>Toc244278153 \h</w:instrText>
         </w:r>
         <w:r>
           <w:rPr>
@@ -6515,7 +6515,7 @@
           <w14:ligatures w14:val="standardContextual"/>
         </w:rPr>
       </w:pPr>
-      <w:hyperlink w:anchor="_Toc244276147" w:history="1">
+      <w:hyperlink w:anchor="_Toc244278154" w:history="1">
         <w:r>
           <w:rPr>
             <w:rStyle w:val="Hyperlink"/>
@@ -6575,7 +6575,7 @@
             <w:noProof/>
             <w:webHidden/>
           </w:rPr>
-          <w:instrText>Toc244276147 \h</w:instrText>
+          <w:instrText>Toc244278154 \h</w:instrText>
         </w:r>
         <w:r>
           <w:rPr>
@@ -6633,7 +6633,7 @@
           <w14:ligatures w14:val="standardContextual"/>
         </w:rPr>
       </w:pPr>
-      <w:hyperlink w:anchor="_Toc244276148" w:history="1">
+      <w:hyperlink w:anchor="_Toc244278155" w:history="1">
         <w:r>
           <w:rPr>
             <w:rStyle w:val="Hyperlink"/>
@@ -6686,7 +6686,7 @@
             <w:noProof/>
             <w:webHidden/>
           </w:rPr>
-          <w:instrText>Toc244276148 \h</w:instrText>
+          <w:instrText>Toc244278155 \h</w:instrText>
         </w:r>
         <w:r>
           <w:rPr>
@@ -6746,7 +6746,7 @@
           <w14:ligatures w14:val="standardContextual"/>
         </w:rPr>
       </w:pPr>
-      <w:hyperlink w:anchor="_Toc244276149" w:history="1">
+      <w:hyperlink w:anchor="_Toc244278156" w:history="1">
         <w:r>
           <w:rPr>
             <w:rStyle w:val="Hyperlink"/>
@@ -6799,7 +6799,7 @@
             <w:noProof/>
             <w:webHidden/>
           </w:rPr>
-          <w:instrText>Toc244276149 \h</w:instrText>
+          <w:instrText>Toc244278156 \h</w:instrText>
         </w:r>
         <w:r>
           <w:rPr>
@@ -6857,7 +6857,7 @@
           <w14:ligatures w14:val="standardContextual"/>
         </w:rPr>
       </w:pPr>
-      <w:hyperlink w:anchor="_Toc244276150" w:history="1">
+      <w:hyperlink w:anchor="_Toc244278157" w:history="1">
         <w:r>
           <w:rPr>
             <w:rStyle w:val="Hyperlink"/>
@@ -6910,7 +6910,7 @@
             <w:noProof/>
             <w:webHidden/>
           </w:rPr>
-          <w:instrText>Toc244276150 \h</w:instrText>
+          <w:instrText>Toc244278157 \h</w:instrText>
         </w:r>
         <w:r>
           <w:rPr>
@@ -6968,7 +6968,7 @@
           <w14:ligatures w14:val="standardContextual"/>
         </w:rPr>
       </w:pPr>
-      <w:hyperlink w:anchor="_Toc244276151" w:history="1">
+      <w:hyperlink w:anchor="_Toc244278158" w:history="1">
         <w:r>
           <w:rPr>
             <w:rStyle w:val="Hyperlink"/>
@@ -7021,7 +7021,7 @@
             <w:noProof/>
             <w:webHidden/>
           </w:rPr>
-          <w:instrText>Toc244276151 \h</w:instrText>
+          <w:instrText>Toc244278158 \h</w:instrText>
         </w:r>
         <w:r>
           <w:rPr>
@@ -7079,7 +7079,7 @@
           <w14:ligatures w14:val="standardContextual"/>
         </w:rPr>
       </w:pPr>
-      <w:hyperlink w:anchor="_Toc244276152" w:history="1">
+      <w:hyperlink w:anchor="_Toc244278159" w:history="1">
         <w:r>
           <w:rPr>
             <w:rStyle w:val="Hyperlink"/>
@@ -7132,7 +7132,7 @@
             <w:noProof/>
             <w:webHidden/>
           </w:rPr>
-          <w:instrText>Toc244276152 \h</w:instrText>
+          <w:instrText>Toc244278159 \h</w:instrText>
         </w:r>
         <w:r>
           <w:rPr>
@@ -7190,7 +7190,7 @@
           <w14:ligatures w14:val="standardContextual"/>
         </w:rPr>
       </w:pPr>
-      <w:hyperlink w:anchor="_Toc244276153" w:history="1">
+      <w:hyperlink w:anchor="_Toc244278160" w:history="1">
         <w:r>
           <w:rPr>
             <w:rStyle w:val="Hyperlink"/>
@@ -7243,7 +7243,7 @@
             <w:noProof/>
             <w:webHidden/>
           </w:rPr>
-          <w:instrText>Toc244276153 \h</w:instrText>
+          <w:instrText>Toc244278160 \h</w:instrText>
         </w:r>
         <w:r>
           <w:rPr>
@@ -7301,7 +7301,7 @@
           <w14:ligatures w14:val="standardContextual"/>
         </w:rPr>
       </w:pPr>
-      <w:hyperlink w:anchor="_Toc244276154" w:history="1">
+      <w:hyperlink w:anchor="_Toc244278161" w:history="1">
         <w:r>
           <w:rPr>
             <w:rStyle w:val="Hyperlink"/>
@@ -7354,7 +7354,7 @@
             <w:noProof/>
             <w:webHidden/>
           </w:rPr>
-          <w:instrText>Toc244276154 \h</w:instrText>
+          <w:instrText>Toc244278161 \h</w:instrText>
         </w:r>
         <w:r>
           <w:rPr>
@@ -7414,7 +7414,7 @@
           <w14:ligatures w14:val="standardContextual"/>
         </w:rPr>
       </w:pPr>
-      <w:hyperlink w:anchor="_Toc244276155" w:history="1">
+      <w:hyperlink w:anchor="_Toc244278162" w:history="1">
         <w:r>
           <w:rPr>
             <w:rStyle w:val="Hyperlink"/>
@@ -7467,7 +7467,7 @@
             <w:noProof/>
             <w:webHidden/>
           </w:rPr>
-          <w:instrText>Toc244276155 \h</w:instrText>
+          <w:instrText>Toc244278162 \h</w:instrText>
         </w:r>
         <w:r>
           <w:rPr>
@@ -7525,7 +7525,7 @@
           <w14:ligatures w14:val="standardContextual"/>
         </w:rPr>
       </w:pPr>
-      <w:hyperlink w:anchor="_Toc244276156" w:history="1">
+      <w:hyperlink w:anchor="_Toc244278163" w:history="1">
         <w:r>
           <w:rPr>
             <w:rStyle w:val="Hyperlink"/>
@@ -7578,7 +7578,7 @@
             <w:noProof/>
             <w:webHidden/>
           </w:rPr>
-          <w:instrText>Toc244276156 \h</w:instrText>
+          <w:instrText>Toc244278163 \h</w:instrText>
         </w:r>
         <w:r>
           <w:rPr>
@@ -7636,7 +7636,7 @@
           <w14:ligatures w14:val="standardContextual"/>
         </w:rPr>
       </w:pPr>
-      <w:hyperlink w:anchor="_Toc244276157" w:history="1">
+      <w:hyperlink w:anchor="_Toc244278164" w:history="1">
         <w:r>
           <w:rPr>
             <w:rStyle w:val="Hyperlink"/>
@@ -7689,7 +7689,7 @@
             <w:noProof/>
             <w:webHidden/>
           </w:rPr>
-          <w:instrText>Toc244276157 \h</w:instrText>
+          <w:instrText>Toc244278164 \h</w:instrText>
         </w:r>
         <w:r>
           <w:rPr>
@@ -7747,7 +7747,7 @@
           <w14:ligatures w14:val="standardContextual"/>
         </w:rPr>
       </w:pPr>
-      <w:hyperlink w:anchor="_Toc244276158" w:history="1">
+      <w:hyperlink w:anchor="_Toc244278165" w:history="1">
         <w:r>
           <w:rPr>
             <w:rStyle w:val="Hyperlink"/>
@@ -7800,7 +7800,7 @@
             <w:noProof/>
             <w:webHidden/>
           </w:rPr>
-          <w:instrText>Toc244276158 \h</w:instrText>
+          <w:instrText>Toc244278165 \h</w:instrText>
         </w:r>
         <w:r>
           <w:rPr>
@@ -7858,7 +7858,7 @@
           <w14:ligatures w14:val="standardContextual"/>
         </w:rPr>
       </w:pPr>
-      <w:hyperlink w:anchor="_Toc244276159" w:history="1">
+      <w:hyperlink w:anchor="_Toc244278166" w:history="1">
         <w:r>
           <w:rPr>
             <w:rStyle w:val="Hyperlink"/>
@@ -7911,7 +7911,7 @@
             <w:noProof/>
             <w:webHidden/>
           </w:rPr>
-          <w:instrText>Toc244276159 \h</w:instrText>
+          <w:instrText>Toc244278166 \h</w:instrText>
         </w:r>
         <w:r>
           <w:rPr>
@@ -7969,7 +7969,7 @@
           <w14:ligatures w14:val="standardContextual"/>
         </w:rPr>
       </w:pPr>
-      <w:hyperlink w:anchor="_Toc244276160" w:history="1">
+      <w:hyperlink w:anchor="_Toc244278167" w:history="1">
         <w:r>
           <w:rPr>
             <w:rStyle w:val="Hyperlink"/>
@@ -8022,7 +8022,7 @@
             <w:noProof/>
             <w:webHidden/>
           </w:rPr>
-          <w:instrText>Toc244276160 \h</w:instrText>
+          <w:instrText>Toc244278167 \h</w:instrText>
         </w:r>
         <w:r>
           <w:rPr>
@@ -8080,7 +8080,7 @@
           <w14:ligatures w14:val="standardContextual"/>
         </w:rPr>
       </w:pPr>
-      <w:hyperlink w:anchor="_Toc244276161" w:history="1">
+      <w:hyperlink w:anchor="_Toc244278168" w:history="1">
         <w:r>
           <w:rPr>
             <w:rStyle w:val="Hyperlink"/>
@@ -8133,7 +8133,7 @@
             <w:noProof/>
             <w:webHidden/>
           </w:rPr>
-          <w:instrText>Toc244276161 \h</w:instrText>
+          <w:instrText>Toc244278168 \h</w:instrText>
         </w:r>
         <w:r>
           <w:rPr>
@@ -8193,7 +8193,7 @@
           <w14:ligatures w14:val="standardContextual"/>
         </w:rPr>
       </w:pPr>
-      <w:hyperlink w:anchor="_Toc244276162" w:history="1">
+      <w:hyperlink w:anchor="_Toc244278169" w:history="1">
         <w:r>
           <w:rPr>
             <w:rStyle w:val="Hyperlink"/>
@@ -8246,7 +8246,7 @@
             <w:noProof/>
             <w:webHidden/>
           </w:rPr>
-          <w:instrText>Toc244276162 \h</w:instrText>
+          <w:instrText>Toc244278169 \h</w:instrText>
         </w:r>
         <w:r>
           <w:rPr>
@@ -8304,7 +8304,7 @@
           <w14:ligatures w14:val="standardContextual"/>
         </w:rPr>
       </w:pPr>
-      <w:hyperlink w:anchor="_Toc244276163" w:history="1">
+      <w:hyperlink w:anchor="_Toc244278170" w:history="1">
         <w:r>
           <w:rPr>
             <w:rStyle w:val="Hyperlink"/>
@@ -8364,7 +8364,7 @@
             <w:noProof/>
             <w:webHidden/>
           </w:rPr>
-          <w:instrText>Toc244276163 \h</w:instrText>
+          <w:instrText>Toc244278170 \h</w:instrText>
         </w:r>
         <w:r>
           <w:rPr>
@@ -8422,7 +8422,7 @@
           <w14:ligatures w14:val="standardContextual"/>
         </w:rPr>
       </w:pPr>
-      <w:hyperlink w:anchor="_Toc244276164" w:history="1">
+      <w:hyperlink w:anchor="_Toc244278171" w:history="1">
         <w:r>
           <w:rPr>
             <w:rStyle w:val="Hyperlink"/>
@@ -8475,7 +8475,7 @@
             <w:noProof/>
             <w:webHidden/>
           </w:rPr>
-          <w:instrText>Toc244276164 \h</w:instrText>
+          <w:instrText>Toc244278171 \h</w:instrText>
         </w:r>
         <w:r>
           <w:rPr>
@@ -8533,7 +8533,7 @@
           <w14:ligatures w14:val="standardContextual"/>
         </w:rPr>
       </w:pPr>
-      <w:hyperlink w:anchor="_Toc244276165" w:history="1">
+      <w:hyperlink w:anchor="_Toc244278172" w:history="1">
         <w:r>
           <w:rPr>
             <w:rStyle w:val="Hyperlink"/>
@@ -8586,7 +8586,7 @@
             <w:noProof/>
             <w:webHidden/>
           </w:rPr>
-          <w:instrText>Toc244276165 \h</w:instrText>
+          <w:instrText>Toc244278172 \h</w:instrText>
         </w:r>
         <w:r>
           <w:rPr>
@@ -8644,7 +8644,7 @@
           <w14:ligatures w14:val="standardContextual"/>
         </w:rPr>
       </w:pPr>
-      <w:hyperlink w:anchor="_Toc244276166" w:history="1">
+      <w:hyperlink w:anchor="_Toc244278173" w:history="1">
         <w:r>
           <w:rPr>
             <w:rStyle w:val="Hyperlink"/>
@@ -8697,7 +8697,7 @@
             <w:noProof/>
             <w:webHidden/>
           </w:rPr>
-          <w:instrText>Toc244276166 \h</w:instrText>
+          <w:instrText>Toc244278173 \h</w:instrText>
         </w:r>
         <w:r>
           <w:rPr>
@@ -8755,7 +8755,7 @@
           <w14:ligatures w14:val="standardContextual"/>
         </w:rPr>
       </w:pPr>
-      <w:hyperlink w:anchor="_Toc244276167" w:history="1">
+      <w:hyperlink w:anchor="_Toc244278174" w:history="1">
         <w:r>
           <w:rPr>
             <w:rStyle w:val="Hyperlink"/>
@@ -8808,7 +8808,7 @@
             <w:noProof/>
             <w:webHidden/>
           </w:rPr>
-          <w:instrText>Toc244276167 \h</w:instrText>
+          <w:instrText>Toc244278174 \h</w:instrText>
         </w:r>
         <w:r>
           <w:rPr>
@@ -8868,7 +8868,7 @@
           <w14:ligatures w14:val="standardContextual"/>
         </w:rPr>
       </w:pPr>
-      <w:hyperlink w:anchor="_Toc244276168" w:history="1">
+      <w:hyperlink w:anchor="_Toc244278175" w:history="1">
         <w:r>
           <w:rPr>
             <w:rStyle w:val="Hyperlink"/>
@@ -8921,7 +8921,7 @@
             <w:noProof/>
             <w:webHidden/>
           </w:rPr>
-          <w:instrText>Toc244276168 \h</w:instrText>
+          <w:instrText>Toc244278175 \h</w:instrText>
         </w:r>
         <w:r>
           <w:rPr>
@@ -8979,7 +8979,7 @@
           <w14:ligatures w14:val="standardContextual"/>
         </w:rPr>
       </w:pPr>
-      <w:hyperlink w:anchor="_Toc244276169" w:history="1">
+      <w:hyperlink w:anchor="_Toc244278176" w:history="1">
         <w:r>
           <w:rPr>
             <w:rStyle w:val="Hyperlink"/>
@@ -9032,7 +9032,7 @@
             <w:noProof/>
             <w:webHidden/>
           </w:rPr>
-          <w:instrText>Toc244276169 \h</w:instrText>
+          <w:instrText>Toc244278176 \h</w:instrText>
         </w:r>
         <w:r>
           <w:rPr>
@@ -9090,7 +9090,7 @@
           <w14:ligatures w14:val="standardContextual"/>
         </w:rPr>
       </w:pPr>
-      <w:hyperlink w:anchor="_Toc244276170" w:history="1">
+      <w:hyperlink w:anchor="_Toc244278177" w:history="1">
         <w:r>
           <w:rPr>
             <w:rStyle w:val="Hyperlink"/>
@@ -9143,7 +9143,7 @@
             <w:noProof/>
             <w:webHidden/>
           </w:rPr>
-          <w:instrText>Toc244276170 \h</w:instrText>
+          <w:instrText>Toc244278177 \h</w:instrText>
         </w:r>
         <w:r>
           <w:rPr>
@@ -9201,7 +9201,7 @@
           <w14:ligatures w14:val="standardContextual"/>
         </w:rPr>
       </w:pPr>
-      <w:hyperlink w:anchor="_Toc244276171" w:history="1">
+      <w:hyperlink w:anchor="_Toc244278178" w:history="1">
         <w:r>
           <w:rPr>
             <w:rStyle w:val="Hyperlink"/>
@@ -9254,7 +9254,7 @@
             <w:noProof/>
             <w:webHidden/>
           </w:rPr>
-          <w:instrText>Toc244276171 \h</w:instrText>
+          <w:instrText>Toc244278178 \h</w:instrText>
         </w:r>
         <w:r>
           <w:rPr>
@@ -9312,7 +9312,7 @@
           <w14:ligatures w14:val="standardContextual"/>
         </w:rPr>
       </w:pPr>
-      <w:hyperlink w:anchor="_Toc244276172" w:history="1">
+      <w:hyperlink w:anchor="_Toc244278179" w:history="1">
         <w:r>
           <w:rPr>
             <w:rStyle w:val="Hyperlink"/>
@@ -9365,7 +9365,7 @@
             <w:noProof/>
             <w:webHidden/>
           </w:rPr>
-          <w:instrText>Toc244276172 \h</w:instrText>
+          <w:instrText>Toc244278179 \h</w:instrText>
         </w:r>
         <w:r>
           <w:rPr>
@@ -9423,7 +9423,7 @@
           <w14:ligatures w14:val="standardContextual"/>
         </w:rPr>
       </w:pPr>
-      <w:hyperlink w:anchor="_Toc244276173" w:history="1">
+      <w:hyperlink w:anchor="_Toc244278180" w:history="1">
         <w:r>
           <w:rPr>
             <w:rStyle w:val="Hyperlink"/>
@@ -9476,7 +9476,7 @@
             <w:noProof/>
             <w:webHidden/>
           </w:rPr>
-          <w:instrText>Toc244276173 \h</w:instrText>
+          <w:instrText>Toc244278180 \h</w:instrText>
         </w:r>
         <w:r>
           <w:rPr>
@@ -9534,7 +9534,7 @@
           <w14:ligatures w14:val="standardContextual"/>
         </w:rPr>
       </w:pPr>
-      <w:hyperlink w:anchor="_Toc244276174" w:history="1">
+      <w:hyperlink w:anchor="_Toc244278181" w:history="1">
         <w:r>
           <w:rPr>
             <w:rStyle w:val="Hyperlink"/>
@@ -9587,7 +9587,7 @@
             <w:noProof/>
             <w:webHidden/>
           </w:rPr>
-          <w:instrText>Toc244276174 \h</w:instrText>
+          <w:instrText>Toc244278181 \h</w:instrText>
         </w:r>
         <w:r>
           <w:rPr>
@@ -9645,7 +9645,7 @@
           <w14:ligatures w14:val="standardContextual"/>
         </w:rPr>
       </w:pPr>
-      <w:hyperlink w:anchor="_Toc244276175" w:history="1">
+      <w:hyperlink w:anchor="_Toc244278182" w:history="1">
         <w:r>
           <w:rPr>
             <w:rStyle w:val="Hyperlink"/>
@@ -9698,7 +9698,7 @@
             <w:noProof/>
             <w:webHidden/>
           </w:rPr>
-          <w:instrText>Toc244276175 \h</w:instrText>
+          <w:instrText>Toc244278182 \h</w:instrText>
         </w:r>
         <w:r>
           <w:rPr>
@@ -9756,7 +9756,7 @@
           <w14:ligatures w14:val="standardContextual"/>
         </w:rPr>
       </w:pPr>
-      <w:hyperlink w:anchor="_Toc244276176" w:history="1">
+      <w:hyperlink w:anchor="_Toc244278183" w:history="1">
         <w:r>
           <w:rPr>
             <w:rStyle w:val="Hyperlink"/>
@@ -9809,7 +9809,7 @@
             <w:noProof/>
             <w:webHidden/>
           </w:rPr>
-          <w:instrText>Toc244276176 \h</w:instrText>
+          <w:instrText>Toc244278183 \h</w:instrText>
         </w:r>
         <w:r>
           <w:rPr>
@@ -9869,7 +9869,7 @@
           <w14:ligatures w14:val="standardContextual"/>
         </w:rPr>
       </w:pPr>
-      <w:hyperlink w:anchor="_Toc244276177" w:history="1">
+      <w:hyperlink w:anchor="_Toc244278184" w:history="1">
         <w:r>
           <w:rPr>
             <w:rStyle w:val="Hyperlink"/>
@@ -9937,7 +9937,7 @@
             <w:noProof/>
             <w:webHidden/>
           </w:rPr>
-          <w:instrText>Toc244276177 \h</w:instrText>
+          <w:instrText>Toc244278184 \h</w:instrText>
         </w:r>
         <w:r>
           <w:rPr>
@@ -9995,7 +9995,7 @@
           <w14:ligatures w14:val="standardContextual"/>
         </w:rPr>
       </w:pPr>
-      <w:hyperlink w:anchor="_Toc244276178" w:history="1">
+      <w:hyperlink w:anchor="_Toc244278185" w:history="1">
         <w:r>
           <w:rPr>
             <w:rStyle w:val="Hyperlink"/>
@@ -10048,7 +10048,7 @@
             <w:noProof/>
             <w:webHidden/>
           </w:rPr>
-          <w:instrText>Toc244276178 \h</w:instrText>
+          <w:instrText>Toc244278185 \h</w:instrText>
         </w:r>
         <w:r>
           <w:rPr>
@@ -10106,7 +10106,7 @@
           <w14:ligatures w14:val="standardContextual"/>
         </w:rPr>
       </w:pPr>
-      <w:hyperlink w:anchor="_Toc244276179" w:history="1">
+      <w:hyperlink w:anchor="_Toc244278186" w:history="1">
         <w:r>
           <w:rPr>
             <w:rStyle w:val="Hyperlink"/>
@@ -10159,7 +10159,7 @@
             <w:noProof/>
             <w:webHidden/>
           </w:rPr>
-          <w:instrText>Toc244276179 \h</w:instrText>
+          <w:instrText>Toc244278186 \h</w:instrText>
         </w:r>
         <w:r>
           <w:rPr>
@@ -10217,7 +10217,7 @@
           <w14:ligatures w14:val="standardContextual"/>
         </w:rPr>
       </w:pPr>
-      <w:hyperlink w:anchor="_Toc244276180" w:history="1">
+      <w:hyperlink w:anchor="_Toc244278187" w:history="1">
         <w:r>
           <w:rPr>
             <w:rStyle w:val="Hyperlink"/>
@@ -10270,7 +10270,7 @@
             <w:noProof/>
             <w:webHidden/>
           </w:rPr>
-          <w:instrText>Toc244276180 \h</w:instrText>
+          <w:instrText>Toc244278187 \h</w:instrText>
         </w:r>
         <w:r>
           <w:rPr>
@@ -10328,7 +10328,7 @@
           <w14:ligatures w14:val="standardContextual"/>
         </w:rPr>
       </w:pPr>
-      <w:hyperlink w:anchor="_Toc244276181" w:history="1">
+      <w:hyperlink w:anchor="_Toc244278188" w:history="1">
         <w:r>
           <w:rPr>
             <w:rStyle w:val="Hyperlink"/>
@@ -10381,7 +10381,7 @@
             <w:noProof/>
             <w:webHidden/>
           </w:rPr>
-          <w:instrText>Toc244276181 \h</w:instrText>
+          <w:instrText>Toc244278188 \h</w:instrText>
         </w:r>
         <w:r>
           <w:rPr>
@@ -10439,7 +10439,7 @@
           <w14:ligatures w14:val="standardContextual"/>
         </w:rPr>
       </w:pPr>
-      <w:hyperlink w:anchor="_Toc244276182" w:history="1">
+      <w:hyperlink w:anchor="_Toc244278189" w:history="1">
         <w:r>
           <w:rPr>
             <w:rStyle w:val="Hyperlink"/>
@@ -10499,7 +10499,7 @@
             <w:noProof/>
             <w:webHidden/>
           </w:rPr>
-          <w:instrText>Toc244276182 \h</w:instrText>
+          <w:instrText>Toc244278189 \h</w:instrText>
         </w:r>
         <w:r>
           <w:rPr>
@@ -10557,7 +10557,7 @@
           <w14:ligatures w14:val="standardContextual"/>
         </w:rPr>
       </w:pPr>
-      <w:hyperlink w:anchor="_Toc244276183" w:history="1">
+      <w:hyperlink w:anchor="_Toc244278190" w:history="1">
         <w:r>
           <w:rPr>
             <w:rStyle w:val="Hyperlink"/>
@@ -10610,7 +10610,7 @@
             <w:noProof/>
             <w:webHidden/>
           </w:rPr>
-          <w:instrText>Toc244276183 \h</w:instrText>
+          <w:instrText>Toc244278190 \h</w:instrText>
         </w:r>
         <w:r>
           <w:rPr>
@@ -10668,7 +10668,7 @@
           <w14:ligatures w14:val="standardContextual"/>
         </w:rPr>
       </w:pPr>
-      <w:hyperlink w:anchor="_Toc244276184" w:history="1">
+      <w:hyperlink w:anchor="_Toc244278191" w:history="1">
         <w:r>
           <w:rPr>
             <w:rStyle w:val="Hyperlink"/>
@@ -10728,7 +10728,7 @@
             <w:noProof/>
             <w:webHidden/>
           </w:rPr>
-          <w:instrText>Toc244276184 \h</w:instrText>
+          <w:instrText>Toc244278191 \h</w:instrText>
         </w:r>
         <w:r>
           <w:rPr>
@@ -10786,7 +10786,7 @@
           <w14:ligatures w14:val="standardContextual"/>
         </w:rPr>
       </w:pPr>
-      <w:hyperlink w:anchor="_Toc244276185" w:history="1">
+      <w:hyperlink w:anchor="_Toc244278192" w:history="1">
         <w:r>
           <w:rPr>
             <w:rStyle w:val="Hyperlink"/>
@@ -10846,7 +10846,7 @@
             <w:noProof/>
             <w:webHidden/>
           </w:rPr>
-          <w:instrText>Toc244276185 \h</w:instrText>
+          <w:instrText>Toc244278192 \h</w:instrText>
         </w:r>
         <w:r>
           <w:rPr>
@@ -10904,7 +10904,7 @@
           <w14:ligatures w14:val="standardContextual"/>
         </w:rPr>
       </w:pPr>
-      <w:hyperlink w:anchor="_Toc244276186" w:history="1">
+      <w:hyperlink w:anchor="_Toc244278193" w:history="1">
         <w:r>
           <w:rPr>
             <w:rStyle w:val="Hyperlink"/>
@@ -10957,7 +10957,7 @@
             <w:noProof/>
             <w:webHidden/>
           </w:rPr>
-          <w:instrText>Toc244276186 \h</w:instrText>
+          <w:instrText>Toc244278193 \h</w:instrText>
         </w:r>
         <w:r>
           <w:rPr>
@@ -11017,7 +11017,7 @@
           <w14:ligatures w14:val="standardContextual"/>
         </w:rPr>
       </w:pPr>
-      <w:hyperlink w:anchor="_Toc244276187" w:history="1">
+      <w:hyperlink w:anchor="_Toc244278194" w:history="1">
         <w:r>
           <w:rPr>
             <w:rStyle w:val="Hyperlink"/>
@@ -11085,7 +11085,7 @@
             <w:noProof/>
             <w:webHidden/>
           </w:rPr>
-          <w:instrText>Toc244276187 \h</w:instrText>
+          <w:instrText>Toc244278194 \h</w:instrText>
         </w:r>
         <w:r>
           <w:rPr>
@@ -11143,7 +11143,7 @@
           <w14:ligatures w14:val="standardContextual"/>
         </w:rPr>
       </w:pPr>
-      <w:hyperlink w:anchor="_Toc244276188" w:history="1">
+      <w:hyperlink w:anchor="_Toc244278195" w:history="1">
         <w:r>
           <w:rPr>
             <w:rStyle w:val="Hyperlink"/>
@@ -11196,7 +11196,7 @@
             <w:noProof/>
             <w:webHidden/>
           </w:rPr>
-          <w:instrText>Toc244276188 \h</w:instrText>
+          <w:instrText>Toc244278195 \h</w:instrText>
         </w:r>
         <w:r>
           <w:rPr>
@@ -11254,7 +11254,7 @@
           <w14:ligatures w14:val="standardContextual"/>
         </w:rPr>
       </w:pPr>
-      <w:hyperlink w:anchor="_Toc244276189" w:history="1">
+      <w:hyperlink w:anchor="_Toc244278196" w:history="1">
         <w:r>
           <w:rPr>
             <w:rStyle w:val="Hyperlink"/>
@@ -11329,7 +11329,7 @@
             <w:noProof/>
             <w:webHidden/>
           </w:rPr>
-          <w:instrText>Toc244276189 \h</w:instrText>
+          <w:instrText>Toc244278196 \h</w:instrText>
         </w:r>
         <w:r>
           <w:rPr>
@@ -11387,7 +11387,7 @@
           <w14:ligatures w14:val="standardContextual"/>
         </w:rPr>
       </w:pPr>
-      <w:hyperlink w:anchor="_Toc244276190" w:history="1">
+      <w:hyperlink w:anchor="_Toc244278197" w:history="1">
         <w:r>
           <w:rPr>
             <w:rStyle w:val="Hyperlink"/>
@@ -11447,7 +11447,7 @@
             <w:noProof/>
             <w:webHidden/>
           </w:rPr>
-          <w:instrText>Toc244276190 \h</w:instrText>
+          <w:instrText>Toc244278197 \h</w:instrText>
         </w:r>
         <w:r>
           <w:rPr>
@@ -11505,7 +11505,7 @@
           <w14:ligatures w14:val="standardContextual"/>
         </w:rPr>
       </w:pPr>
-      <w:hyperlink w:anchor="_Toc244276191" w:history="1">
+      <w:hyperlink w:anchor="_Toc244278198" w:history="1">
         <w:r>
           <w:rPr>
             <w:rStyle w:val="Hyperlink"/>
@@ -11565,7 +11565,7 @@
             <w:noProof/>
             <w:webHidden/>
           </w:rPr>
-          <w:instrText>Toc244276191 \h</w:instrText>
+          <w:instrText>Toc244278198 \h</w:instrText>
         </w:r>
         <w:r>
           <w:rPr>
@@ -11623,7 +11623,7 @@
           <w14:ligatures w14:val="standardContextual"/>
         </w:rPr>
       </w:pPr>
-      <w:hyperlink w:anchor="_Toc244276192" w:history="1">
+      <w:hyperlink w:anchor="_Toc244278199" w:history="1">
         <w:r>
           <w:rPr>
             <w:rStyle w:val="Hyperlink"/>
@@ -11683,7 +11683,7 @@
             <w:noProof/>
             <w:webHidden/>
           </w:rPr>
-          <w:instrText>Toc244276192 \h</w:instrText>
+          <w:instrText>Toc244278199 \h</w:instrText>
         </w:r>
         <w:r>
           <w:rPr>
@@ -11741,7 +11741,7 @@
           <w14:ligatures w14:val="standardContextual"/>
         </w:rPr>
       </w:pPr>
-      <w:hyperlink w:anchor="_Toc244276193" w:history="1">
+      <w:hyperlink w:anchor="_Toc244278200" w:history="1">
         <w:r>
           <w:rPr>
             <w:rStyle w:val="Hyperlink"/>
@@ -11801,7 +11801,7 @@
             <w:noProof/>
             <w:webHidden/>
           </w:rPr>
-          <w:instrText>Toc244276193 \h</w:instrText>
+          <w:instrText>Toc244278200 \h</w:instrText>
         </w:r>
         <w:r>
           <w:rPr>
@@ -11859,7 +11859,7 @@
           <w14:ligatures w14:val="standardContextual"/>
         </w:rPr>
       </w:pPr>
-      <w:hyperlink w:anchor="_Toc244276194" w:history="1">
+      <w:hyperlink w:anchor="_Toc244278201" w:history="1">
         <w:r>
           <w:rPr>
             <w:rStyle w:val="Hyperlink"/>
@@ -11919,7 +11919,7 @@
             <w:noProof/>
             <w:webHidden/>
           </w:rPr>
-          <w:instrText>Toc244276194 \h</w:instrText>
+          <w:instrText>Toc244278201 \h</w:instrText>
         </w:r>
         <w:r>
           <w:rPr>
@@ -11977,7 +11977,7 @@
           <w14:ligatures w14:val="standardContextual"/>
         </w:rPr>
       </w:pPr>
-      <w:hyperlink w:anchor="_Toc244276195" w:history="1">
+      <w:hyperlink w:anchor="_Toc244278202" w:history="1">
         <w:r>
           <w:rPr>
             <w:rStyle w:val="Hyperlink"/>
@@ -12037,7 +12037,7 @@
             <w:noProof/>
             <w:webHidden/>
           </w:rPr>
-          <w:instrText>Toc244276195 \h</w:instrText>
+          <w:instrText>Toc244278202 \h</w:instrText>
         </w:r>
         <w:r>
           <w:rPr>
@@ -12097,7 +12097,7 @@
           <w14:ligatures w14:val="standardContextual"/>
         </w:rPr>
       </w:pPr>
-      <w:hyperlink w:anchor="_Toc244276196" w:history="1">
+      <w:hyperlink w:anchor="_Toc244278203" w:history="1">
         <w:r>
           <w:rPr>
             <w:rStyle w:val="Hyperlink"/>
@@ -12150,7 +12150,7 @@
             <w:noProof/>
             <w:webHidden/>
           </w:rPr>
-          <w:instrText>Toc244276196 \h</w:instrText>
+          <w:instrText>Toc244278203 \h</w:instrText>
         </w:r>
         <w:r>
           <w:rPr>
@@ -12208,7 +12208,7 @@
           <w14:ligatures w14:val="standardContextual"/>
         </w:rPr>
       </w:pPr>
-      <w:hyperlink w:anchor="_Toc244276197" w:history="1">
+      <w:hyperlink w:anchor="_Toc244278204" w:history="1">
         <w:r>
           <w:rPr>
             <w:rStyle w:val="Hyperlink"/>
@@ -12268,7 +12268,7 @@
             <w:noProof/>
             <w:webHidden/>
           </w:rPr>
-          <w:instrText>Toc244276197 \h</w:instrText>
+          <w:instrText>Toc244278204 \h</w:instrText>
         </w:r>
         <w:r>
           <w:rPr>
@@ -12326,7 +12326,7 @@
           <w14:ligatures w14:val="standardContextual"/>
         </w:rPr>
       </w:pPr>
-      <w:hyperlink w:anchor="_Toc244276198" w:history="1">
+      <w:hyperlink w:anchor="_Toc244278205" w:history="1">
         <w:r>
           <w:rPr>
             <w:rStyle w:val="Hyperlink"/>
@@ -12379,7 +12379,7 @@
             <w:noProof/>
             <w:webHidden/>
           </w:rPr>
-          <w:instrText>Toc244276198 \h</w:instrText>
+          <w:instrText>Toc244278205 \h</w:instrText>
         </w:r>
         <w:r>
           <w:rPr>
@@ -12439,7 +12439,7 @@
           <w14:ligatures w14:val="standardContextual"/>
         </w:rPr>
       </w:pPr>
-      <w:hyperlink w:anchor="_Toc244276199" w:history="1">
+      <w:hyperlink w:anchor="_Toc244278206" w:history="1">
         <w:r>
           <w:rPr>
             <w:rStyle w:val="Hyperlink"/>
@@ -12492,7 +12492,7 @@
             <w:noProof/>
             <w:webHidden/>
           </w:rPr>
-          <w:instrText>Toc244276199 \h</w:instrText>
+          <w:instrText>Toc244278206 \h</w:instrText>
         </w:r>
         <w:r>
           <w:rPr>
@@ -12550,7 +12550,7 @@
           <w14:ligatures w14:val="standardContextual"/>
         </w:rPr>
       </w:pPr>
-      <w:hyperlink w:anchor="_Toc244276200" w:history="1">
+      <w:hyperlink w:anchor="_Toc244278207" w:history="1">
         <w:r>
           <w:rPr>
             <w:rStyle w:val="Hyperlink"/>
@@ -12603,7 +12603,7 @@
             <w:noProof/>
             <w:webHidden/>
           </w:rPr>
-          <w:instrText>Toc244276200 \h</w:instrText>
+          <w:instrText>Toc244278207 \h</w:instrText>
         </w:r>
         <w:r>
           <w:rPr>
@@ -12661,7 +12661,7 @@
           <w14:ligatures w14:val="standardContextual"/>
         </w:rPr>
       </w:pPr>
-      <w:hyperlink w:anchor="_Toc244276201" w:history="1">
+      <w:hyperlink w:anchor="_Toc244278208" w:history="1">
         <w:r>
           <w:rPr>
             <w:rStyle w:val="Hyperlink"/>
@@ -12721,7 +12721,7 @@
             <w:noProof/>
             <w:webHidden/>
           </w:rPr>
-          <w:instrText>Toc244276201 \h</w:instrText>
+          <w:instrText>Toc244278208 \h</w:instrText>
         </w:r>
         <w:r>
           <w:rPr>
@@ -12779,7 +12779,7 @@
           <w14:ligatures w14:val="standardContextual"/>
         </w:rPr>
       </w:pPr>
-      <w:hyperlink w:anchor="_Toc244276202" w:history="1">
+      <w:hyperlink w:anchor="_Toc244278209" w:history="1">
         <w:r>
           <w:rPr>
             <w:rStyle w:val="Hyperlink"/>
@@ -12832,7 +12832,7 @@
             <w:noProof/>
             <w:webHidden/>
           </w:rPr>
-          <w:instrText>Toc244276202 \h</w:instrText>
+          <w:instrText>Toc244278209 \h</w:instrText>
         </w:r>
         <w:r>
           <w:rPr>
@@ -12892,7 +12892,7 @@
           <w14:ligatures w14:val="standardContextual"/>
         </w:rPr>
       </w:pPr>
-      <w:hyperlink w:anchor="_Toc244276203" w:history="1">
+      <w:hyperlink w:anchor="_Toc244278210" w:history="1">
         <w:r>
           <w:rPr>
             <w:rStyle w:val="Hyperlink"/>
@@ -12945,7 +12945,7 @@
             <w:noProof/>
             <w:webHidden/>
           </w:rPr>
-          <w:instrText>Toc244276203 \h</w:instrText>
+          <w:instrText>Toc244278210 \h</w:instrText>
         </w:r>
         <w:r>
           <w:rPr>
@@ -13003,7 +13003,7 @@
           <w14:ligatures w14:val="standardContextual"/>
         </w:rPr>
       </w:pPr>
-      <w:hyperlink w:anchor="_Toc244276204" w:history="1">
+      <w:hyperlink w:anchor="_Toc244278211" w:history="1">
         <w:r>
           <w:rPr>
             <w:rStyle w:val="Hyperlink"/>
@@ -13056,7 +13056,7 @@
             <w:noProof/>
             <w:webHidden/>
           </w:rPr>
-          <w:instrText>Toc244276204 \h</w:instrText>
+          <w:instrText>Toc244278211 \h</w:instrText>
         </w:r>
         <w:r>
           <w:rPr>
@@ -13114,7 +13114,7 @@
           <w14:ligatures w14:val="standardContextual"/>
         </w:rPr>
       </w:pPr>
-      <w:hyperlink w:anchor="_Toc244276205" w:history="1">
+      <w:hyperlink w:anchor="_Toc244278212" w:history="1">
         <w:r>
           <w:rPr>
             <w:rStyle w:val="Hyperlink"/>
@@ -13167,7 +13167,7 @@
             <w:noProof/>
             <w:webHidden/>
           </w:rPr>
-          <w:instrText>Toc244276205 \h</w:instrText>
+          <w:instrText>Toc244278212 \h</w:instrText>
         </w:r>
         <w:r>
           <w:rPr>
@@ -13227,7 +13227,7 @@
           <w14:ligatures w14:val="standardContextual"/>
         </w:rPr>
       </w:pPr>
-      <w:hyperlink w:anchor="_Toc244276206" w:history="1">
+      <w:hyperlink w:anchor="_Toc244278213" w:history="1">
         <w:r>
           <w:rPr>
             <w:rStyle w:val="Hyperlink"/>
@@ -13280,7 +13280,7 @@
             <w:noProof/>
             <w:webHidden/>
           </w:rPr>
-          <w:instrText>Toc244276206 \h</w:instrText>
+          <w:instrText>Toc244278213 \h</w:instrText>
         </w:r>
         <w:r>
           <w:rPr>
@@ -13340,7 +13340,7 @@
           <w14:ligatures w14:val="standardContextual"/>
         </w:rPr>
       </w:pPr>
-      <w:hyperlink w:anchor="_Toc244276207" w:history="1">
+      <w:hyperlink w:anchor="_Toc244278214" w:history="1">
         <w:r>
           <w:rPr>
             <w:rStyle w:val="Hyperlink"/>
@@ -13393,7 +13393,7 @@
             <w:noProof/>
             <w:webHidden/>
           </w:rPr>
-          <w:instrText>Toc244276207 \h</w:instrText>
+          <w:instrText>Toc244278214 \h</w:instrText>
         </w:r>
         <w:r>
           <w:rPr>
@@ -13446,7 +13446,7 @@
         <w:pStyle w:val="Heading1"/>
         <w:pageBreakBefore/>
       </w:pPr>
-      <w:bookmarkStart w:id="0" w:name="_Toc244276091"/>
+      <w:bookmarkStart w:id="0" w:name="_Toc244278098"/>
       <w:r>
         <w:rPr>
           <w:rtl/>
@@ -13460,7 +13460,7 @@
       <w:pPr>
         <w:pStyle w:val="Heading2"/>
       </w:pPr>
-      <w:bookmarkStart w:id="1" w:name="_Toc244276092"/>
+      <w:bookmarkStart w:id="1" w:name="_Toc244278099"/>
       <w:r>
         <w:rPr>
           <w:rtl/>
@@ -13557,7 +13557,7 @@
       <w:pPr>
         <w:pStyle w:val="Heading2"/>
       </w:pPr>
-      <w:bookmarkStart w:id="2" w:name="_Toc244276093"/>
+      <w:bookmarkStart w:id="2" w:name="_Toc244278100"/>
       <w:r>
         <w:rPr>
           <w:rtl/>
@@ -14016,7 +14016,7 @@
       <w:pPr>
         <w:pStyle w:val="Heading2"/>
       </w:pPr>
-      <w:bookmarkStart w:id="3" w:name="_Toc244276094"/>
+      <w:bookmarkStart w:id="3" w:name="_Toc244278101"/>
       <w:r>
         <w:rPr>
           <w:rtl/>
@@ -14149,7 +14149,7 @@
       <w:pPr>
         <w:pStyle w:val="Heading2"/>
       </w:pPr>
-      <w:bookmarkStart w:id="4" w:name="_Toc244276095"/>
+      <w:bookmarkStart w:id="4" w:name="_Toc244278102"/>
       <w:r>
         <w:rPr>
           <w:rtl/>
@@ -14958,7 +14958,7 @@
         <w:pStyle w:val="Heading1"/>
         <w:pageBreakBefore/>
       </w:pPr>
-      <w:bookmarkStart w:id="5" w:name="_Toc244276096"/>
+      <w:bookmarkStart w:id="5" w:name="_Toc244278103"/>
       <w:r>
         <w:rPr>
           <w:rtl/>
@@ -14980,7 +14980,7 @@
       <w:pPr>
         <w:pStyle w:val="Heading2"/>
       </w:pPr>
-      <w:bookmarkStart w:id="6" w:name="_Toc244276097"/>
+      <w:bookmarkStart w:id="6" w:name="_Toc244278104"/>
       <w:r>
         <w:rPr>
           <w:rtl/>
@@ -15103,7 +15103,7 @@
       <w:pPr>
         <w:pStyle w:val="Heading2"/>
       </w:pPr>
-      <w:bookmarkStart w:id="7" w:name="_Toc244276098"/>
+      <w:bookmarkStart w:id="7" w:name="_Toc244278105"/>
       <w:r>
         <w:rPr>
           <w:rtl/>
@@ -15852,7 +15852,7 @@
       <w:pPr>
         <w:pStyle w:val="Heading2"/>
       </w:pPr>
-      <w:bookmarkStart w:id="8" w:name="_Toc244276099"/>
+      <w:bookmarkStart w:id="8" w:name="_Toc244278106"/>
       <w:r>
         <w:rPr>
           <w:rtl/>
@@ -15962,7 +15962,7 @@
       <w:pPr>
         <w:pStyle w:val="Heading2"/>
       </w:pPr>
-      <w:bookmarkStart w:id="9" w:name="_Toc244276100"/>
+      <w:bookmarkStart w:id="9" w:name="_Toc244278107"/>
       <w:r>
         <w:rPr>
           <w:rtl/>
@@ -16172,7 +16172,7 @@
       <w:pPr>
         <w:pStyle w:val="Heading2"/>
       </w:pPr>
-      <w:bookmarkStart w:id="10" w:name="_Toc244276101"/>
+      <w:bookmarkStart w:id="10" w:name="_Toc244278108"/>
       <w:r>
         <w:rPr>
           <w:rtl/>
@@ -16223,7 +16223,7 @@
       <w:pPr>
         <w:pStyle w:val="Heading2"/>
       </w:pPr>
-      <w:bookmarkStart w:id="11" w:name="_Toc244276102"/>
+      <w:bookmarkStart w:id="11" w:name="_Toc244278109"/>
       <w:r>
         <w:rPr>
           <w:rtl/>
@@ -16304,7 +16304,7 @@
       <w:pPr>
         <w:pStyle w:val="Heading2"/>
       </w:pPr>
-      <w:bookmarkStart w:id="12" w:name="_Toc244276103"/>
+      <w:bookmarkStart w:id="12" w:name="_Toc244278110"/>
       <w:r>
         <w:rPr>
           <w:rtl/>
@@ -16340,7 +16340,7 @@
       <w:pPr>
         <w:pStyle w:val="Heading2"/>
       </w:pPr>
-      <w:bookmarkStart w:id="13" w:name="_Toc244276104"/>
+      <w:bookmarkStart w:id="13" w:name="_Toc244278111"/>
       <w:r>
         <w:rPr>
           <w:rtl/>
@@ -16860,7 +16860,7 @@
       <w:pPr>
         <w:pStyle w:val="Heading2"/>
       </w:pPr>
-      <w:bookmarkStart w:id="14" w:name="_Toc244276105"/>
+      <w:bookmarkStart w:id="14" w:name="_Toc244278112"/>
       <w:r>
         <w:rPr>
           <w:rtl/>
@@ -17016,7 +17016,7 @@
         <w:pStyle w:val="Heading1"/>
         <w:pageBreakBefore/>
       </w:pPr>
-      <w:bookmarkStart w:id="15" w:name="_Toc244276106"/>
+      <w:bookmarkStart w:id="15" w:name="_Toc244278113"/>
       <w:r>
         <w:rPr>
           <w:rtl/>
@@ -17030,7 +17030,7 @@
       <w:pPr>
         <w:pStyle w:val="Heading2"/>
       </w:pPr>
-      <w:bookmarkStart w:id="16" w:name="_Toc244276107"/>
+      <w:bookmarkStart w:id="16" w:name="_Toc244278114"/>
       <w:r>
         <w:rPr>
           <w:rtl/>
@@ -17643,7 +17643,7 @@
       <w:pPr>
         <w:pStyle w:val="Heading2"/>
       </w:pPr>
-      <w:bookmarkStart w:id="17" w:name="_Toc244276108"/>
+      <w:bookmarkStart w:id="17" w:name="_Toc244278115"/>
       <w:r>
         <w:rPr>
           <w:rtl/>
@@ -17743,7 +17743,7 @@
         <w:jc w:val="left"/>
       </w:pPr>
       <w:r>
-        <w:t xml:space="preserve">  Parameter list code generator 01.03.01</w:t>
+        <w:t xml:space="preserve">  Parameter list code generator 01.04.01</w:t>
       </w:r>
     </w:p>
     <w:p>
@@ -18323,7 +18323,7 @@
       <w:pPr>
         <w:pStyle w:val="Heading2"/>
       </w:pPr>
-      <w:bookmarkStart w:id="18" w:name="_Toc244276109"/>
+      <w:bookmarkStart w:id="18" w:name="_Toc244278116"/>
       <w:r>
         <w:rPr>
           <w:rtl/>
@@ -18487,7 +18487,7 @@
       <w:pPr>
         <w:pStyle w:val="Heading2"/>
       </w:pPr>
-      <w:bookmarkStart w:id="19" w:name="_Toc244276110"/>
+      <w:bookmarkStart w:id="19" w:name="_Toc244278117"/>
       <w:r>
         <w:rPr>
           <w:rtl/>
@@ -18996,7 +18996,7 @@
       <w:pPr>
         <w:pStyle w:val="Heading2"/>
       </w:pPr>
-      <w:bookmarkStart w:id="20" w:name="_Toc244276111"/>
+      <w:bookmarkStart w:id="20" w:name="_Toc244278118"/>
       <w:r>
         <w:rPr>
           <w:rtl/>
@@ -19080,7 +19080,7 @@
       <w:pPr>
         <w:pStyle w:val="Heading2"/>
       </w:pPr>
-      <w:bookmarkStart w:id="21" w:name="_Toc244276112"/>
+      <w:bookmarkStart w:id="21" w:name="_Toc244278119"/>
       <w:r>
         <w:rPr>
           <w:rtl/>
@@ -19536,7 +19536,7 @@
         <w:pStyle w:val="Heading1"/>
         <w:pageBreakBefore/>
       </w:pPr>
-      <w:bookmarkStart w:id="22" w:name="_Toc244276113"/>
+      <w:bookmarkStart w:id="22" w:name="_Toc244278120"/>
       <w:r>
         <w:rPr>
           <w:rtl/>
@@ -21017,7 +21017,7 @@
         </w:rPr>
         <w:lastRenderedPageBreak/>
         <w:drawing>
-          <wp:inline distT="0" distB="0" distL="0" distR="0" wp14:anchorId="69F26D4D" wp14:editId="1458153E">
+          <wp:inline distT="0" distB="0" distL="0" distR="0" wp14:anchorId="15A9293E" wp14:editId="159FEEEA">
             <wp:extent cx="4140000" cy="4980204"/>
             <wp:effectExtent l="0" t="0" r="0" b="0"/>
             <wp:docPr id="1" name="Figure 1"/>
@@ -21201,7 +21201,7 @@
         <w:pStyle w:val="Heading1"/>
         <w:pageBreakBefore/>
       </w:pPr>
-      <w:bookmarkStart w:id="23" w:name="_Toc244276114"/>
+      <w:bookmarkStart w:id="23" w:name="_Toc244278121"/>
       <w:r>
         <w:rPr>
           <w:rtl/>
@@ -21215,7 +21215,7 @@
       <w:pPr>
         <w:pStyle w:val="Heading2"/>
       </w:pPr>
-      <w:bookmarkStart w:id="24" w:name="_Toc244276115"/>
+      <w:bookmarkStart w:id="24" w:name="_Toc244278122"/>
       <w:r>
         <w:rPr>
           <w:rtl/>
@@ -21770,7 +21770,7 @@
       <w:pPr>
         <w:pStyle w:val="Heading2"/>
       </w:pPr>
-      <w:bookmarkStart w:id="25" w:name="_Toc244276116"/>
+      <w:bookmarkStart w:id="25" w:name="_Toc244278123"/>
       <w:r>
         <w:rPr>
           <w:rtl/>
@@ -21826,7 +21826,7 @@
         </w:rPr>
         <w:lastRenderedPageBreak/>
         <w:drawing>
-          <wp:inline distT="0" distB="0" distL="0" distR="0" wp14:anchorId="12339F14" wp14:editId="616A748A">
+          <wp:inline distT="0" distB="0" distL="0" distR="0" wp14:anchorId="339D541C" wp14:editId="35B08C7D">
             <wp:extent cx="3960000" cy="2761224"/>
             <wp:effectExtent l="0" t="0" r="0" b="0"/>
             <wp:docPr id="2" name="Figure 2"/>
@@ -22253,7 +22253,7 @@
       <w:pPr>
         <w:pStyle w:val="Heading2"/>
       </w:pPr>
-      <w:bookmarkStart w:id="26" w:name="_Toc244276117"/>
+      <w:bookmarkStart w:id="26" w:name="_Toc244278124"/>
       <w:r>
         <w:rPr>
           <w:rtl/>
@@ -22451,7 +22451,7 @@
       <w:pPr>
         <w:pStyle w:val="Heading2"/>
       </w:pPr>
-      <w:bookmarkStart w:id="27" w:name="_Toc244276118"/>
+      <w:bookmarkStart w:id="27" w:name="_Toc244278125"/>
       <w:r>
         <w:rPr>
           <w:rtl/>
@@ -22506,7 +22506,7 @@
           <w:noProof/>
         </w:rPr>
         <w:drawing>
-          <wp:inline distT="0" distB="0" distL="0" distR="0" wp14:anchorId="4C05CDC4" wp14:editId="15B3A6CE">
+          <wp:inline distT="0" distB="0" distL="0" distR="0" wp14:anchorId="510A7AD7" wp14:editId="1A17655F">
             <wp:extent cx="2736000" cy="1494276"/>
             <wp:effectExtent l="0" t="0" r="0" b="0"/>
             <wp:docPr id="3" name="Figure 3"/>
@@ -22577,7 +22577,7 @@
           <w:noProof/>
         </w:rPr>
         <w:drawing>
-          <wp:inline distT="0" distB="0" distL="0" distR="0" wp14:anchorId="2812F512" wp14:editId="7A506AE8">
+          <wp:inline distT="0" distB="0" distL="0" distR="0" wp14:anchorId="0E98AA22" wp14:editId="11C38BCF">
             <wp:extent cx="3096000" cy="1939448"/>
             <wp:effectExtent l="0" t="0" r="0" b="0"/>
             <wp:docPr id="4" name="Figure 4"/>
@@ -22656,7 +22656,7 @@
       <w:pPr>
         <w:pStyle w:val="Heading2"/>
       </w:pPr>
-      <w:bookmarkStart w:id="28" w:name="_Toc244276119"/>
+      <w:bookmarkStart w:id="28" w:name="_Toc244278126"/>
       <w:r>
         <w:rPr>
           <w:rtl/>
@@ -22719,7 +22719,7 @@
         <w:pStyle w:val="Heading1"/>
         <w:pageBreakBefore/>
       </w:pPr>
-      <w:bookmarkStart w:id="29" w:name="_Toc244276120"/>
+      <w:bookmarkStart w:id="29" w:name="_Toc244278127"/>
       <w:r>
         <w:rPr>
           <w:rtl/>
@@ -22733,7 +22733,7 @@
       <w:pPr>
         <w:pStyle w:val="Heading2"/>
       </w:pPr>
-      <w:bookmarkStart w:id="30" w:name="_Toc244276121"/>
+      <w:bookmarkStart w:id="30" w:name="_Toc244278128"/>
       <w:r>
         <w:rPr>
           <w:rtl/>
@@ -22774,7 +22774,7 @@
           <w:noProof/>
         </w:rPr>
         <w:drawing>
-          <wp:inline distT="0" distB="0" distL="0" distR="0" wp14:anchorId="7A224F66" wp14:editId="114CE57B">
+          <wp:inline distT="0" distB="0" distL="0" distR="0" wp14:anchorId="15D7332F" wp14:editId="7BD34147">
             <wp:extent cx="5903999" cy="3689999"/>
             <wp:effectExtent l="0" t="0" r="0" b="0"/>
             <wp:docPr id="5" name="Figure 5"/>
@@ -24111,7 +24111,7 @@
       <w:pPr>
         <w:pStyle w:val="Heading2"/>
       </w:pPr>
-      <w:bookmarkStart w:id="31" w:name="_Toc244276122"/>
+      <w:bookmarkStart w:id="31" w:name="_Toc244278129"/>
       <w:r>
         <w:rPr>
           <w:rtl/>
@@ -24148,7 +24148,7 @@
         </w:rPr>
         <w:lastRenderedPageBreak/>
         <w:drawing>
-          <wp:inline distT="0" distB="0" distL="0" distR="0" wp14:anchorId="4E0C690A" wp14:editId="4D2677CE">
+          <wp:inline distT="0" distB="0" distL="0" distR="0" wp14:anchorId="727C2B43" wp14:editId="2094ADE4">
             <wp:extent cx="5400000" cy="3180925"/>
             <wp:effectExtent l="0" t="0" r="0" b="0"/>
             <wp:docPr id="6" name="Figure 6"/>
@@ -25098,7 +25098,7 @@
           <w:noProof/>
         </w:rPr>
         <w:drawing>
-          <wp:inline distT="0" distB="0" distL="0" distR="0" wp14:anchorId="57CEE523" wp14:editId="37395E9C">
+          <wp:inline distT="0" distB="0" distL="0" distR="0" wp14:anchorId="02DFC3BF" wp14:editId="5D65278A">
             <wp:extent cx="5400000" cy="3180925"/>
             <wp:effectExtent l="0" t="0" r="0" b="0"/>
             <wp:docPr id="7" name="Figure 7"/>
@@ -25160,7 +25160,7 @@
           <w:noProof/>
         </w:rPr>
         <w:drawing>
-          <wp:inline distT="0" distB="0" distL="0" distR="0" wp14:anchorId="2EEF59EB" wp14:editId="2F595EA5">
+          <wp:inline distT="0" distB="0" distL="0" distR="0" wp14:anchorId="0CAAB8F9" wp14:editId="0C86D8CA">
             <wp:extent cx="5400000" cy="3180925"/>
             <wp:effectExtent l="0" t="0" r="0" b="0"/>
             <wp:docPr id="8" name="Figure 8"/>
@@ -25408,7 +25408,7 @@
       <w:pPr>
         <w:pStyle w:val="Heading2"/>
       </w:pPr>
-      <w:bookmarkStart w:id="32" w:name="_Toc244276123"/>
+      <w:bookmarkStart w:id="32" w:name="_Toc244278130"/>
       <w:r>
         <w:rPr>
           <w:rtl/>
@@ -25639,7 +25639,7 @@
       <w:pPr>
         <w:pStyle w:val="Heading2"/>
       </w:pPr>
-      <w:bookmarkStart w:id="33" w:name="_Toc244276124"/>
+      <w:bookmarkStart w:id="33" w:name="_Toc244278131"/>
       <w:r>
         <w:rPr>
           <w:rtl/>
@@ -25709,7 +25709,7 @@
       <w:pPr>
         <w:pStyle w:val="Heading2"/>
       </w:pPr>
-      <w:bookmarkStart w:id="34" w:name="_Toc244276125"/>
+      <w:bookmarkStart w:id="34" w:name="_Toc244278132"/>
       <w:r>
         <w:rPr>
           <w:rtl/>
@@ -25759,7 +25759,7 @@
         <w:pStyle w:val="Heading1"/>
         <w:pageBreakBefore/>
       </w:pPr>
-      <w:bookmarkStart w:id="35" w:name="_Toc244276126"/>
+      <w:bookmarkStart w:id="35" w:name="_Toc244278133"/>
       <w:r>
         <w:rPr>
           <w:rtl/>
@@ -25773,7 +25773,7 @@
       <w:pPr>
         <w:pStyle w:val="Heading2"/>
       </w:pPr>
-      <w:bookmarkStart w:id="36" w:name="_Toc244276127"/>
+      <w:bookmarkStart w:id="36" w:name="_Toc244278134"/>
       <w:r>
         <w:rPr>
           <w:rtl/>
@@ -26526,7 +26526,7 @@
       <w:pPr>
         <w:pStyle w:val="Heading2"/>
       </w:pPr>
-      <w:bookmarkStart w:id="37" w:name="_Toc244276128"/>
+      <w:bookmarkStart w:id="37" w:name="_Toc244278135"/>
       <w:r>
         <w:rPr>
           <w:rtl/>
@@ -26584,7 +26584,7 @@
                 <w:noProof/>
               </w:rPr>
               <w:drawing>
-                <wp:inline distT="0" distB="0" distL="0" distR="0" wp14:anchorId="1290A45B" wp14:editId="51FDE451">
+                <wp:inline distT="0" distB="0" distL="0" distR="0" wp14:anchorId="2C3776EE" wp14:editId="66DA4F1E">
                   <wp:extent cx="2736000" cy="3004381"/>
                   <wp:effectExtent l="0" t="0" r="0" b="0"/>
                   <wp:docPr id="9" name="Figure 9"/>
@@ -26663,7 +26663,7 @@
                 <w:noProof/>
               </w:rPr>
               <w:drawing>
-                <wp:inline distT="0" distB="0" distL="0" distR="0" wp14:anchorId="142CC62E" wp14:editId="14BB8285">
+                <wp:inline distT="0" distB="0" distL="0" distR="0" wp14:anchorId="601A16C0" wp14:editId="63E7B052">
                   <wp:extent cx="2736000" cy="2657722"/>
                   <wp:effectExtent l="0" t="0" r="0" b="0"/>
                   <wp:docPr id="10" name="Figure 10"/>
@@ -27877,7 +27877,7 @@
       <w:pPr>
         <w:pStyle w:val="Heading2"/>
       </w:pPr>
-      <w:bookmarkStart w:id="38" w:name="_Toc244276129"/>
+      <w:bookmarkStart w:id="38" w:name="_Toc244278136"/>
       <w:r>
         <w:rPr>
           <w:rtl/>
@@ -27969,7 +27969,7 @@
           <w:noProof/>
         </w:rPr>
         <w:drawing>
-          <wp:inline distT="0" distB="0" distL="0" distR="0" wp14:anchorId="788AD771" wp14:editId="017813EC">
+          <wp:inline distT="0" distB="0" distL="0" distR="0" wp14:anchorId="4A641B32" wp14:editId="7D742C18">
             <wp:extent cx="2592000" cy="3390081"/>
             <wp:effectExtent l="0" t="0" r="0" b="0"/>
             <wp:docPr id="11" name="Figure 11"/>
@@ -28313,7 +28313,7 @@
       <w:pPr>
         <w:pStyle w:val="Heading2"/>
       </w:pPr>
-      <w:bookmarkStart w:id="39" w:name="_Toc244276130"/>
+      <w:bookmarkStart w:id="39" w:name="_Toc244278137"/>
       <w:r>
         <w:rPr>
           <w:rtl/>
@@ -28823,7 +28823,7 @@
         </w:rPr>
         <w:lastRenderedPageBreak/>
         <w:drawing>
-          <wp:inline distT="0" distB="0" distL="0" distR="0" wp14:anchorId="76A10099" wp14:editId="19A0F2CF">
+          <wp:inline distT="0" distB="0" distL="0" distR="0" wp14:anchorId="6CCC9A3D" wp14:editId="00460A61">
             <wp:extent cx="5903999" cy="3689999"/>
             <wp:effectExtent l="0" t="0" r="0" b="0"/>
             <wp:docPr id="12" name="Figure 12"/>
@@ -29018,7 +29018,7 @@
       <w:pPr>
         <w:pStyle w:val="Heading2"/>
       </w:pPr>
-      <w:bookmarkStart w:id="40" w:name="_Toc244276131"/>
+      <w:bookmarkStart w:id="40" w:name="_Toc244278138"/>
       <w:r>
         <w:rPr>
           <w:rtl/>
@@ -29333,7 +29333,7 @@
       <w:pPr>
         <w:pStyle w:val="Heading2"/>
       </w:pPr>
-      <w:bookmarkStart w:id="41" w:name="_Toc244276132"/>
+      <w:bookmarkStart w:id="41" w:name="_Toc244278139"/>
       <w:r>
         <w:rPr>
           <w:rtl/>
@@ -29552,7 +29552,7 @@
       <w:pPr>
         <w:pStyle w:val="Heading2"/>
       </w:pPr>
-      <w:bookmarkStart w:id="42" w:name="_Toc244276133"/>
+      <w:bookmarkStart w:id="42" w:name="_Toc244278140"/>
       <w:r>
         <w:rPr>
           <w:rtl/>
@@ -29612,7 +29612,7 @@
       <w:pPr>
         <w:pStyle w:val="Heading2"/>
       </w:pPr>
-      <w:bookmarkStart w:id="43" w:name="_Toc244276134"/>
+      <w:bookmarkStart w:id="43" w:name="_Toc244278141"/>
       <w:r>
         <w:rPr>
           <w:rtl/>
@@ -29849,7 +29849,7 @@
         <w:pStyle w:val="Heading1"/>
         <w:pageBreakBefore/>
       </w:pPr>
-      <w:bookmarkStart w:id="44" w:name="_Toc244276135"/>
+      <w:bookmarkStart w:id="44" w:name="_Toc244278142"/>
       <w:r>
         <w:rPr>
           <w:rtl/>
@@ -29863,7 +29863,7 @@
       <w:pPr>
         <w:pStyle w:val="Heading2"/>
       </w:pPr>
-      <w:bookmarkStart w:id="45" w:name="_Toc244276136"/>
+      <w:bookmarkStart w:id="45" w:name="_Toc244278143"/>
       <w:r>
         <w:rPr>
           <w:rtl/>
@@ -29940,7 +29940,7 @@
       <w:pPr>
         <w:pStyle w:val="Heading2"/>
       </w:pPr>
-      <w:bookmarkStart w:id="46" w:name="_Toc244276137"/>
+      <w:bookmarkStart w:id="46" w:name="_Toc244278144"/>
       <w:r>
         <w:rPr>
           <w:rtl/>
@@ -29989,7 +29989,7 @@
           <w:noProof/>
         </w:rPr>
         <w:drawing>
-          <wp:inline distT="0" distB="0" distL="0" distR="0" wp14:anchorId="4E8FAC91" wp14:editId="78DC0772">
+          <wp:inline distT="0" distB="0" distL="0" distR="0" wp14:anchorId="1A08D43A" wp14:editId="5FC27642">
             <wp:extent cx="3780000" cy="3432857"/>
             <wp:effectExtent l="0" t="0" r="0" b="0"/>
             <wp:docPr id="13" name="Figure 13"/>
@@ -30487,7 +30487,7 @@
       <w:pPr>
         <w:pStyle w:val="Heading2"/>
       </w:pPr>
-      <w:bookmarkStart w:id="47" w:name="_Toc244276138"/>
+      <w:bookmarkStart w:id="47" w:name="_Toc244278145"/>
       <w:r>
         <w:rPr>
           <w:rtl/>
@@ -30564,7 +30564,7 @@
           <w:noProof/>
         </w:rPr>
         <w:drawing>
-          <wp:inline distT="0" distB="0" distL="0" distR="0" wp14:anchorId="2C169946" wp14:editId="7A02EBD1">
+          <wp:inline distT="0" distB="0" distL="0" distR="0" wp14:anchorId="423FAB3B" wp14:editId="1F98E003">
             <wp:extent cx="3780000" cy="2194285"/>
             <wp:effectExtent l="0" t="0" r="0" b="0"/>
             <wp:docPr id="14" name="Figure 14"/>
@@ -30627,7 +30627,7 @@
         </w:rPr>
         <w:lastRenderedPageBreak/>
         <w:drawing>
-          <wp:inline distT="0" distB="0" distL="0" distR="0" wp14:anchorId="5D1DA583" wp14:editId="556384B4">
+          <wp:inline distT="0" distB="0" distL="0" distR="0" wp14:anchorId="46D683F1" wp14:editId="2E909EE0">
             <wp:extent cx="3780000" cy="2502857"/>
             <wp:effectExtent l="0" t="0" r="0" b="0"/>
             <wp:docPr id="15" name="Figure 15"/>
@@ -30709,7 +30709,7 @@
       <w:pPr>
         <w:pStyle w:val="Heading2"/>
       </w:pPr>
-      <w:bookmarkStart w:id="48" w:name="_Toc244276139"/>
+      <w:bookmarkStart w:id="48" w:name="_Toc244278146"/>
       <w:r>
         <w:rPr>
           <w:rtl/>
@@ -30934,7 +30934,7 @@
               </w:rPr>
               <w:lastRenderedPageBreak/>
               <w:drawing>
-                <wp:inline distT="0" distB="0" distL="0" distR="0" wp14:anchorId="65E6DFBB" wp14:editId="6521E9D0">
+                <wp:inline distT="0" distB="0" distL="0" distR="0" wp14:anchorId="7D2BC78B" wp14:editId="13932D57">
                   <wp:extent cx="2736000" cy="2907465"/>
                   <wp:effectExtent l="0" t="0" r="0" b="0"/>
                   <wp:docPr id="16" name="Figure 16"/>
@@ -31001,7 +31001,7 @@
                 <w:noProof/>
               </w:rPr>
               <w:drawing>
-                <wp:inline distT="0" distB="0" distL="0" distR="0" wp14:anchorId="6113CB71" wp14:editId="4F70AA0E">
+                <wp:inline distT="0" distB="0" distL="0" distR="0" wp14:anchorId="103F103D" wp14:editId="5E5EBF63">
                   <wp:extent cx="2736000" cy="2914920"/>
                   <wp:effectExtent l="0" t="0" r="0" b="0"/>
                   <wp:docPr id="17" name="Figure 17"/>
@@ -31100,7 +31100,7 @@
       <w:pPr>
         <w:pStyle w:val="Heading2"/>
       </w:pPr>
-      <w:bookmarkStart w:id="49" w:name="_Toc244276140"/>
+      <w:bookmarkStart w:id="49" w:name="_Toc244278147"/>
       <w:r>
         <w:rPr>
           <w:rtl/>
@@ -31880,7 +31880,7 @@
       <w:pPr>
         <w:pStyle w:val="Heading2"/>
       </w:pPr>
-      <w:bookmarkStart w:id="50" w:name="_Toc244276141"/>
+      <w:bookmarkStart w:id="50" w:name="_Toc244278148"/>
       <w:r>
         <w:rPr>
           <w:rtl/>
@@ -32411,7 +32411,7 @@
         <w:pStyle w:val="Heading1"/>
         <w:pageBreakBefore/>
       </w:pPr>
-      <w:bookmarkStart w:id="51" w:name="_Toc244276142"/>
+      <w:bookmarkStart w:id="51" w:name="_Toc244278149"/>
       <w:r>
         <w:rPr>
           <w:rtl/>
@@ -32447,7 +32447,7 @@
       <w:pPr>
         <w:pStyle w:val="Heading2"/>
       </w:pPr>
-      <w:bookmarkStart w:id="52" w:name="_Toc244276143"/>
+      <w:bookmarkStart w:id="52" w:name="_Toc244278150"/>
       <w:r>
         <w:rPr>
           <w:rtl/>
@@ -32673,7 +32673,7 @@
       <w:pPr>
         <w:pStyle w:val="Heading2"/>
       </w:pPr>
-      <w:bookmarkStart w:id="53" w:name="_Toc244276144"/>
+      <w:bookmarkStart w:id="53" w:name="_Toc244278151"/>
       <w:r>
         <w:rPr>
           <w:rtl/>
@@ -32729,7 +32729,7 @@
         </w:rPr>
         <w:lastRenderedPageBreak/>
         <w:drawing>
-          <wp:inline distT="0" distB="0" distL="0" distR="0" wp14:anchorId="3038CC87" wp14:editId="0E0B3109">
+          <wp:inline distT="0" distB="0" distL="0" distR="0" wp14:anchorId="73E120E3" wp14:editId="1EB7A232">
             <wp:extent cx="4680000" cy="3396455"/>
             <wp:effectExtent l="0" t="0" r="0" b="0"/>
             <wp:docPr id="18" name="Figure 18"/>
@@ -33443,7 +33443,7 @@
       <w:pPr>
         <w:pStyle w:val="Heading2"/>
       </w:pPr>
-      <w:bookmarkStart w:id="54" w:name="_Toc244276145"/>
+      <w:bookmarkStart w:id="54" w:name="_Toc244278152"/>
       <w:r>
         <w:rPr>
           <w:rtl/>
@@ -33516,7 +33516,7 @@
           <w:noProof/>
         </w:rPr>
         <w:drawing>
-          <wp:inline distT="0" distB="0" distL="0" distR="0" wp14:anchorId="5E64DF83" wp14:editId="5EDF9C19">
+          <wp:inline distT="0" distB="0" distL="0" distR="0" wp14:anchorId="05D62A37" wp14:editId="041E2F7D">
             <wp:extent cx="3096000" cy="3627465"/>
             <wp:effectExtent l="0" t="0" r="0" b="0"/>
             <wp:docPr id="19" name="Figure 19"/>
@@ -33782,7 +33782,7 @@
       <w:pPr>
         <w:pStyle w:val="Heading2"/>
       </w:pPr>
-      <w:bookmarkStart w:id="55" w:name="_Toc244276146"/>
+      <w:bookmarkStart w:id="55" w:name="_Toc244278153"/>
       <w:r>
         <w:rPr>
           <w:rtl/>
@@ -34111,7 +34111,7 @@
       <w:pPr>
         <w:pStyle w:val="Heading2"/>
       </w:pPr>
-      <w:bookmarkStart w:id="56" w:name="_Toc244276147"/>
+      <w:bookmarkStart w:id="56" w:name="_Toc244278154"/>
       <w:r>
         <w:rPr>
           <w:rtl/>
@@ -34712,7 +34712,7 @@
       <w:pPr>
         <w:pStyle w:val="Heading2"/>
       </w:pPr>
-      <w:bookmarkStart w:id="57" w:name="_Toc244276148"/>
+      <w:bookmarkStart w:id="57" w:name="_Toc244278155"/>
       <w:r>
         <w:rPr>
           <w:rtl/>
@@ -35251,7 +35251,7 @@
         <w:pStyle w:val="Heading1"/>
         <w:pageBreakBefore/>
       </w:pPr>
-      <w:bookmarkStart w:id="58" w:name="_Toc244276149"/>
+      <w:bookmarkStart w:id="58" w:name="_Toc244278156"/>
       <w:r>
         <w:rPr>
           <w:rtl/>
@@ -35265,7 +35265,7 @@
       <w:pPr>
         <w:pStyle w:val="Heading2"/>
       </w:pPr>
-      <w:bookmarkStart w:id="59" w:name="_Toc244276150"/>
+      <w:bookmarkStart w:id="59" w:name="_Toc244278157"/>
       <w:r>
         <w:rPr>
           <w:rtl/>
@@ -35335,7 +35335,7 @@
           <w:noProof/>
         </w:rPr>
         <w:drawing>
-          <wp:inline distT="0" distB="0" distL="0" distR="0" wp14:anchorId="4374606B" wp14:editId="62A3D3F1">
+          <wp:inline distT="0" distB="0" distL="0" distR="0" wp14:anchorId="15108808" wp14:editId="363F6888">
             <wp:extent cx="3780000" cy="2610000"/>
             <wp:effectExtent l="0" t="0" r="0" b="0"/>
             <wp:docPr id="20" name="Figure 20"/>
@@ -35887,7 +35887,7 @@
       <w:pPr>
         <w:pStyle w:val="Heading2"/>
       </w:pPr>
-      <w:bookmarkStart w:id="60" w:name="_Toc244276151"/>
+      <w:bookmarkStart w:id="60" w:name="_Toc244278158"/>
       <w:r>
         <w:rPr>
           <w:rtl/>
@@ -35928,7 +35928,7 @@
           <w:noProof/>
         </w:rPr>
         <w:drawing>
-          <wp:inline distT="0" distB="0" distL="0" distR="0" wp14:anchorId="4206B40B" wp14:editId="1635EEA1">
+          <wp:inline distT="0" distB="0" distL="0" distR="0" wp14:anchorId="399A0A24" wp14:editId="6583CDA9">
             <wp:extent cx="3780000" cy="1851428"/>
             <wp:effectExtent l="0" t="0" r="0" b="0"/>
             <wp:docPr id="21" name="Figure 21"/>
@@ -36263,7 +36263,7 @@
       <w:pPr>
         <w:pStyle w:val="Heading2"/>
       </w:pPr>
-      <w:bookmarkStart w:id="61" w:name="_Toc244276152"/>
+      <w:bookmarkStart w:id="61" w:name="_Toc244278159"/>
       <w:r>
         <w:rPr>
           <w:rtl/>
@@ -36394,7 +36394,7 @@
       <w:pPr>
         <w:pStyle w:val="Heading2"/>
       </w:pPr>
-      <w:bookmarkStart w:id="62" w:name="_Toc244276153"/>
+      <w:bookmarkStart w:id="62" w:name="_Toc244278160"/>
       <w:r>
         <w:rPr>
           <w:rtl/>
@@ -36525,7 +36525,7 @@
       <w:pPr>
         <w:pStyle w:val="Heading2"/>
       </w:pPr>
-      <w:bookmarkStart w:id="63" w:name="_Toc244276154"/>
+      <w:bookmarkStart w:id="63" w:name="_Toc244278161"/>
       <w:r>
         <w:rPr>
           <w:rtl/>
@@ -36589,7 +36589,7 @@
         </w:rPr>
         <w:lastRenderedPageBreak/>
         <w:drawing>
-          <wp:inline distT="0" distB="0" distL="0" distR="0" wp14:anchorId="2E1047CB" wp14:editId="419EFE27">
+          <wp:inline distT="0" distB="0" distL="0" distR="0" wp14:anchorId="0C75AA48" wp14:editId="1912567D">
             <wp:extent cx="5400000" cy="2056241"/>
             <wp:effectExtent l="0" t="0" r="0" b="0"/>
             <wp:docPr id="22" name="Figure 22"/>
@@ -36663,7 +36663,7 @@
         <w:pStyle w:val="Heading1"/>
         <w:pageBreakBefore/>
       </w:pPr>
-      <w:bookmarkStart w:id="64" w:name="_Toc244276155"/>
+      <w:bookmarkStart w:id="64" w:name="_Toc244278162"/>
       <w:r>
         <w:rPr>
           <w:rtl/>
@@ -36677,7 +36677,7 @@
       <w:pPr>
         <w:pStyle w:val="Heading2"/>
       </w:pPr>
-      <w:bookmarkStart w:id="65" w:name="_Toc244276156"/>
+      <w:bookmarkStart w:id="65" w:name="_Toc244278163"/>
       <w:r>
         <w:rPr>
           <w:rtl/>
@@ -37481,7 +37481,7 @@
       <w:pPr>
         <w:pStyle w:val="Heading2"/>
       </w:pPr>
-      <w:bookmarkStart w:id="66" w:name="_Toc244276157"/>
+      <w:bookmarkStart w:id="66" w:name="_Toc244278164"/>
       <w:r>
         <w:rPr>
           <w:rtl/>
@@ -37669,7 +37669,7 @@
       <w:pPr>
         <w:pStyle w:val="Heading2"/>
       </w:pPr>
-      <w:bookmarkStart w:id="67" w:name="_Toc244276158"/>
+      <w:bookmarkStart w:id="67" w:name="_Toc244278165"/>
       <w:r>
         <w:rPr>
           <w:rtl/>
@@ -38296,7 +38296,7 @@
       <w:pPr>
         <w:pStyle w:val="Heading2"/>
       </w:pPr>
-      <w:bookmarkStart w:id="68" w:name="_Toc244276159"/>
+      <w:bookmarkStart w:id="68" w:name="_Toc244278166"/>
       <w:r>
         <w:rPr>
           <w:rtl/>
@@ -38853,7 +38853,7 @@
       <w:pPr>
         <w:pStyle w:val="Heading2"/>
       </w:pPr>
-      <w:bookmarkStart w:id="69" w:name="_Toc244276160"/>
+      <w:bookmarkStart w:id="69" w:name="_Toc244278167"/>
       <w:r>
         <w:rPr>
           <w:rtl/>
@@ -38909,7 +38909,7 @@
         </w:rPr>
         <w:lastRenderedPageBreak/>
         <w:drawing>
-          <wp:inline distT="0" distB="0" distL="0" distR="0" wp14:anchorId="0B88FBFB" wp14:editId="21378F8C">
+          <wp:inline distT="0" distB="0" distL="0" distR="0" wp14:anchorId="6F8CB414" wp14:editId="03E545BA">
             <wp:extent cx="3420000" cy="4245918"/>
             <wp:effectExtent l="0" t="0" r="0" b="0"/>
             <wp:docPr id="23" name="Figure 23"/>
@@ -40170,7 +40170,7 @@
       <w:pPr>
         <w:pStyle w:val="Heading2"/>
       </w:pPr>
-      <w:bookmarkStart w:id="70" w:name="_Toc244276161"/>
+      <w:bookmarkStart w:id="70" w:name="_Toc244278168"/>
       <w:r>
         <w:rPr>
           <w:rtl/>
@@ -40489,7 +40489,7 @@
         <w:pStyle w:val="Heading1"/>
         <w:pageBreakBefore/>
       </w:pPr>
-      <w:bookmarkStart w:id="71" w:name="_Toc244276162"/>
+      <w:bookmarkStart w:id="71" w:name="_Toc244278169"/>
       <w:r>
         <w:rPr>
           <w:rtl/>
@@ -40503,7 +40503,7 @@
       <w:pPr>
         <w:pStyle w:val="Heading2"/>
       </w:pPr>
-      <w:bookmarkStart w:id="72" w:name="_Toc244276163"/>
+      <w:bookmarkStart w:id="72" w:name="_Toc244278170"/>
       <w:r>
         <w:rPr>
           <w:rtl/>
@@ -40628,7 +40628,7 @@
       <w:pPr>
         <w:pStyle w:val="Heading2"/>
       </w:pPr>
-      <w:bookmarkStart w:id="73" w:name="_Toc244276164"/>
+      <w:bookmarkStart w:id="73" w:name="_Toc244278171"/>
       <w:r>
         <w:rPr>
           <w:rtl/>
@@ -41225,7 +41225,7 @@
       <w:pPr>
         <w:pStyle w:val="Heading2"/>
       </w:pPr>
-      <w:bookmarkStart w:id="74" w:name="_Toc244276165"/>
+      <w:bookmarkStart w:id="74" w:name="_Toc244278172"/>
       <w:r>
         <w:rPr>
           <w:rtl/>
@@ -42084,7 +42084,7 @@
       <w:pPr>
         <w:pStyle w:val="Heading2"/>
       </w:pPr>
-      <w:bookmarkStart w:id="75" w:name="_Toc244276166"/>
+      <w:bookmarkStart w:id="75" w:name="_Toc244278173"/>
       <w:r>
         <w:rPr>
           <w:rtl/>
@@ -42141,7 +42141,7 @@
         </w:rPr>
         <w:lastRenderedPageBreak/>
         <w:drawing>
-          <wp:inline distT="0" distB="0" distL="0" distR="0" wp14:anchorId="6B8AACA6" wp14:editId="420E3E63">
+          <wp:inline distT="0" distB="0" distL="0" distR="0" wp14:anchorId="0DB097C3" wp14:editId="4ABAC73E">
             <wp:extent cx="3960000" cy="5019591"/>
             <wp:effectExtent l="0" t="0" r="0" b="0"/>
             <wp:docPr id="24" name="Figure 24"/>
@@ -42314,7 +42314,7 @@
       <w:pPr>
         <w:pStyle w:val="Heading2"/>
       </w:pPr>
-      <w:bookmarkStart w:id="76" w:name="_Toc244276167"/>
+      <w:bookmarkStart w:id="76" w:name="_Toc244278174"/>
       <w:r>
         <w:rPr>
           <w:rtl/>
@@ -43073,7 +43073,7 @@
         <w:pStyle w:val="Heading1"/>
         <w:pageBreakBefore/>
       </w:pPr>
-      <w:bookmarkStart w:id="77" w:name="_Toc244276168"/>
+      <w:bookmarkStart w:id="77" w:name="_Toc244278175"/>
       <w:r>
         <w:rPr>
           <w:rtl/>
@@ -43113,7 +43113,7 @@
       <w:pPr>
         <w:pStyle w:val="Heading2"/>
       </w:pPr>
-      <w:bookmarkStart w:id="78" w:name="_Toc244276169"/>
+      <w:bookmarkStart w:id="78" w:name="_Toc244278176"/>
       <w:r>
         <w:rPr>
           <w:rtl/>
@@ -43394,7 +43394,7 @@
       <w:pPr>
         <w:pStyle w:val="Heading2"/>
       </w:pPr>
-      <w:bookmarkStart w:id="79" w:name="_Toc244276170"/>
+      <w:bookmarkStart w:id="79" w:name="_Toc244278177"/>
       <w:r>
         <w:rPr>
           <w:rtl/>
@@ -43790,7 +43790,7 @@
       <w:pPr>
         <w:pStyle w:val="Heading2"/>
       </w:pPr>
-      <w:bookmarkStart w:id="80" w:name="_Toc244276171"/>
+      <w:bookmarkStart w:id="80" w:name="_Toc244278178"/>
       <w:r>
         <w:rPr>
           <w:rtl/>
@@ -44281,7 +44281,7 @@
       <w:pPr>
         <w:pStyle w:val="Heading2"/>
       </w:pPr>
-      <w:bookmarkStart w:id="81" w:name="_Toc244276172"/>
+      <w:bookmarkStart w:id="81" w:name="_Toc244278179"/>
       <w:r>
         <w:rPr>
           <w:rtl/>
@@ -44477,7 +44477,7 @@
       <w:pPr>
         <w:pStyle w:val="Heading2"/>
       </w:pPr>
-      <w:bookmarkStart w:id="82" w:name="_Toc244276173"/>
+      <w:bookmarkStart w:id="82" w:name="_Toc244278180"/>
       <w:r>
         <w:rPr>
           <w:rtl/>
@@ -44622,7 +44622,7 @@
       <w:pPr>
         <w:pStyle w:val="Heading2"/>
       </w:pPr>
-      <w:bookmarkStart w:id="83" w:name="_Toc244276174"/>
+      <w:bookmarkStart w:id="83" w:name="_Toc244278181"/>
       <w:r>
         <w:rPr>
           <w:rtl/>
@@ -44871,7 +44871,7 @@
       <w:pPr>
         <w:pStyle w:val="Heading2"/>
       </w:pPr>
-      <w:bookmarkStart w:id="84" w:name="_Toc244276175"/>
+      <w:bookmarkStart w:id="84" w:name="_Toc244278182"/>
       <w:r>
         <w:rPr>
           <w:rtl/>
@@ -45954,7 +45954,7 @@
       <w:pPr>
         <w:pStyle w:val="Heading2"/>
       </w:pPr>
-      <w:bookmarkStart w:id="85" w:name="_Toc244276176"/>
+      <w:bookmarkStart w:id="85" w:name="_Toc244278183"/>
       <w:r>
         <w:rPr>
           <w:rtl/>
@@ -45991,7 +45991,7 @@
         <w:pStyle w:val="Heading1"/>
         <w:pageBreakBefore/>
       </w:pPr>
-      <w:bookmarkStart w:id="86" w:name="_Toc244276177"/>
+      <w:bookmarkStart w:id="86" w:name="_Toc244278184"/>
       <w:r>
         <w:rPr>
           <w:rtl/>
@@ -46014,7 +46014,7 @@
       <w:pPr>
         <w:pStyle w:val="Heading2"/>
       </w:pPr>
-      <w:bookmarkStart w:id="87" w:name="_Toc244276178"/>
+      <w:bookmarkStart w:id="87" w:name="_Toc244278185"/>
       <w:r>
         <w:rPr>
           <w:rtl/>
@@ -46102,7 +46102,7 @@
           <w:noProof/>
         </w:rPr>
         <w:drawing>
-          <wp:inline distT="0" distB="0" distL="0" distR="0" wp14:anchorId="377C2CF7" wp14:editId="31D5C0C5">
+          <wp:inline distT="0" distB="0" distL="0" distR="0" wp14:anchorId="7A7A6039" wp14:editId="43CA6E95">
             <wp:extent cx="5903999" cy="3689999"/>
             <wp:effectExtent l="0" t="0" r="0" b="0"/>
             <wp:docPr id="25" name="Figure 25"/>
@@ -46420,7 +46420,7 @@
       <w:pPr>
         <w:pStyle w:val="Heading2"/>
       </w:pPr>
-      <w:bookmarkStart w:id="88" w:name="_Toc244276179"/>
+      <w:bookmarkStart w:id="88" w:name="_Toc244278186"/>
       <w:r>
         <w:rPr>
           <w:rtl/>
@@ -46641,7 +46641,7 @@
       <w:pPr>
         <w:pStyle w:val="Heading2"/>
       </w:pPr>
-      <w:bookmarkStart w:id="89" w:name="_Toc244276180"/>
+      <w:bookmarkStart w:id="89" w:name="_Toc244278187"/>
       <w:r>
         <w:rPr>
           <w:rtl/>
@@ -47165,7 +47165,7 @@
       <w:pPr>
         <w:pStyle w:val="Heading2"/>
       </w:pPr>
-      <w:bookmarkStart w:id="90" w:name="_Toc244276181"/>
+      <w:bookmarkStart w:id="90" w:name="_Toc244278188"/>
       <w:r>
         <w:rPr>
           <w:rtl/>
@@ -47290,7 +47290,7 @@
       <w:pPr>
         <w:pStyle w:val="Heading2"/>
       </w:pPr>
-      <w:bookmarkStart w:id="91" w:name="_Toc244276182"/>
+      <w:bookmarkStart w:id="91" w:name="_Toc244278189"/>
       <w:r>
         <w:rPr>
           <w:rtl/>
@@ -48329,7 +48329,7 @@
       <w:pPr>
         <w:pStyle w:val="Heading2"/>
       </w:pPr>
-      <w:bookmarkStart w:id="92" w:name="_Toc244276183"/>
+      <w:bookmarkStart w:id="92" w:name="_Toc244278190"/>
       <w:r>
         <w:rPr>
           <w:rtl/>
@@ -48920,7 +48920,7 @@
       <w:pPr>
         <w:pStyle w:val="Heading2"/>
       </w:pPr>
-      <w:bookmarkStart w:id="93" w:name="_Toc244276184"/>
+      <w:bookmarkStart w:id="93" w:name="_Toc244278191"/>
       <w:r>
         <w:rPr>
           <w:rtl/>
@@ -49107,7 +49107,7 @@
       <w:pPr>
         <w:pStyle w:val="Heading2"/>
       </w:pPr>
-      <w:bookmarkStart w:id="94" w:name="_Toc244276185"/>
+      <w:bookmarkStart w:id="94" w:name="_Toc244278192"/>
       <w:r>
         <w:rPr>
           <w:rtl/>
@@ -49380,7 +49380,7 @@
       <w:pPr>
         <w:pStyle w:val="Heading2"/>
       </w:pPr>
-      <w:bookmarkStart w:id="95" w:name="_Toc244276186"/>
+      <w:bookmarkStart w:id="95" w:name="_Toc244278193"/>
       <w:r>
         <w:rPr>
           <w:rtl/>
@@ -49427,7 +49427,7 @@
         <w:pStyle w:val="Heading1"/>
         <w:pageBreakBefore/>
       </w:pPr>
-      <w:bookmarkStart w:id="96" w:name="_Toc244276187"/>
+      <w:bookmarkStart w:id="96" w:name="_Toc244278194"/>
       <w:r>
         <w:rPr>
           <w:rtl/>
@@ -49450,7 +49450,7 @@
       <w:pPr>
         <w:pStyle w:val="Heading2"/>
       </w:pPr>
-      <w:bookmarkStart w:id="97" w:name="_Toc244276188"/>
+      <w:bookmarkStart w:id="97" w:name="_Toc244278195"/>
       <w:r>
         <w:rPr>
           <w:rtl/>
@@ -50186,7 +50186,7 @@
       <w:pPr>
         <w:pStyle w:val="Heading2"/>
       </w:pPr>
-      <w:bookmarkStart w:id="98" w:name="_Toc244276189"/>
+      <w:bookmarkStart w:id="98" w:name="_Toc244278196"/>
       <w:r>
         <w:rPr>
           <w:rtl/>
@@ -50533,7 +50533,7 @@
       <w:pPr>
         <w:pStyle w:val="Heading2"/>
       </w:pPr>
-      <w:bookmarkStart w:id="99" w:name="_Toc244276190"/>
+      <w:bookmarkStart w:id="99" w:name="_Toc244278197"/>
       <w:r>
         <w:rPr>
           <w:rtl/>
@@ -51004,7 +51004,7 @@
       <w:pPr>
         <w:pStyle w:val="Heading2"/>
       </w:pPr>
-      <w:bookmarkStart w:id="100" w:name="_Toc244276191"/>
+      <w:bookmarkStart w:id="100" w:name="_Toc244278198"/>
       <w:r>
         <w:rPr>
           <w:rtl/>
@@ -51272,7 +51272,7 @@
       <w:pPr>
         <w:pStyle w:val="Heading2"/>
       </w:pPr>
-      <w:bookmarkStart w:id="101" w:name="_Toc244276192"/>
+      <w:bookmarkStart w:id="101" w:name="_Toc244278199"/>
       <w:r>
         <w:rPr>
           <w:rtl/>
@@ -52182,7 +52182,7 @@
       <w:pPr>
         <w:pStyle w:val="Heading2"/>
       </w:pPr>
-      <w:bookmarkStart w:id="102" w:name="_Toc244276193"/>
+      <w:bookmarkStart w:id="102" w:name="_Toc244278200"/>
       <w:r>
         <w:rPr>
           <w:rtl/>
@@ -52448,7 +52448,7 @@
       <w:pPr>
         <w:pStyle w:val="Heading2"/>
       </w:pPr>
-      <w:bookmarkStart w:id="103" w:name="_Toc244276194"/>
+      <w:bookmarkStart w:id="103" w:name="_Toc244278201"/>
       <w:r>
         <w:rPr>
           <w:rtl/>
@@ -52568,7 +52568,7 @@
       <w:pPr>
         <w:pStyle w:val="Heading2"/>
       </w:pPr>
-      <w:bookmarkStart w:id="104" w:name="_Toc244276195"/>
+      <w:bookmarkStart w:id="104" w:name="_Toc244278202"/>
       <w:r>
         <w:rPr>
           <w:rtl/>
@@ -52620,7 +52620,7 @@
           <w:noProof/>
         </w:rPr>
         <w:drawing>
-          <wp:inline distT="0" distB="0" distL="0" distR="0" wp14:anchorId="70511284" wp14:editId="714040B2">
+          <wp:inline distT="0" distB="0" distL="0" distR="0" wp14:anchorId="480117FB" wp14:editId="6D01C775">
             <wp:extent cx="1944000" cy="1206131"/>
             <wp:effectExtent l="0" t="0" r="0" b="0"/>
             <wp:docPr id="26" name="Figure 26"/>
@@ -52683,7 +52683,7 @@
         </w:rPr>
         <w:lastRenderedPageBreak/>
         <w:drawing>
-          <wp:inline distT="0" distB="0" distL="0" distR="0" wp14:anchorId="48FED87C" wp14:editId="73C3F592">
+          <wp:inline distT="0" distB="0" distL="0" distR="0" wp14:anchorId="784DB415" wp14:editId="58028F13">
             <wp:extent cx="4680000" cy="3396455"/>
             <wp:effectExtent l="0" t="0" r="0" b="0"/>
             <wp:docPr id="27" name="Figure 27"/>
@@ -53102,7 +53102,7 @@
         </w:rPr>
         <w:lastRenderedPageBreak/>
         <w:drawing>
-          <wp:inline distT="0" distB="0" distL="0" distR="0" wp14:anchorId="3FB0CACA" wp14:editId="7C607ED2">
+          <wp:inline distT="0" distB="0" distL="0" distR="0" wp14:anchorId="7537B912" wp14:editId="75C3DA54">
             <wp:extent cx="4680000" cy="3396455"/>
             <wp:effectExtent l="0" t="0" r="0" b="0"/>
             <wp:docPr id="28" name="Figure 28"/>
@@ -53367,7 +53367,7 @@
         <w:pStyle w:val="Heading1"/>
         <w:pageBreakBefore/>
       </w:pPr>
-      <w:bookmarkStart w:id="105" w:name="_Toc244276196"/>
+      <w:bookmarkStart w:id="105" w:name="_Toc244278203"/>
       <w:r>
         <w:rPr>
           <w:rtl/>
@@ -53381,7 +53381,7 @@
       <w:pPr>
         <w:pStyle w:val="Heading2"/>
       </w:pPr>
-      <w:bookmarkStart w:id="106" w:name="_Toc244276197"/>
+      <w:bookmarkStart w:id="106" w:name="_Toc244278204"/>
       <w:r>
         <w:rPr>
           <w:rtl/>
@@ -53425,7 +53425,7 @@
           <w:noProof/>
         </w:rPr>
         <w:drawing>
-          <wp:inline distT="0" distB="0" distL="0" distR="0" wp14:anchorId="1CEE3D85" wp14:editId="7ABADB46">
+          <wp:inline distT="0" distB="0" distL="0" distR="0" wp14:anchorId="759BACD7" wp14:editId="7042BCB2">
             <wp:extent cx="5903999" cy="778999"/>
             <wp:effectExtent l="0" t="0" r="0" b="0"/>
             <wp:docPr id="29" name="Figure 29"/>
@@ -53877,7 +53877,7 @@
       <w:pPr>
         <w:pStyle w:val="Heading2"/>
       </w:pPr>
-      <w:bookmarkStart w:id="107" w:name="_Toc244276198"/>
+      <w:bookmarkStart w:id="107" w:name="_Toc244278205"/>
       <w:r>
         <w:rPr>
           <w:rtl/>
@@ -57408,7 +57408,7 @@
         <w:pStyle w:val="Heading1"/>
         <w:pageBreakBefore/>
       </w:pPr>
-      <w:bookmarkStart w:id="108" w:name="_Toc244276199"/>
+      <w:bookmarkStart w:id="108" w:name="_Toc244278206"/>
       <w:r>
         <w:rPr>
           <w:rtl/>
@@ -57430,7 +57430,7 @@
       <w:pPr>
         <w:pStyle w:val="Heading2"/>
       </w:pPr>
-      <w:bookmarkStart w:id="109" w:name="_Toc244276200"/>
+      <w:bookmarkStart w:id="109" w:name="_Toc244278207"/>
       <w:r>
         <w:rPr>
           <w:rtl/>
@@ -57496,7 +57496,7 @@
       <w:pPr>
         <w:pStyle w:val="Heading2"/>
       </w:pPr>
-      <w:bookmarkStart w:id="110" w:name="_Toc244276201"/>
+      <w:bookmarkStart w:id="110" w:name="_Toc244278208"/>
       <w:r>
         <w:rPr>
           <w:rtl/>
@@ -58183,7 +58183,7 @@
       <w:pPr>
         <w:pStyle w:val="Heading2"/>
       </w:pPr>
-      <w:bookmarkStart w:id="111" w:name="_Toc244276202"/>
+      <w:bookmarkStart w:id="111" w:name="_Toc244278209"/>
       <w:r>
         <w:rPr>
           <w:rtl/>
@@ -58650,7 +58650,7 @@
         <w:pStyle w:val="Heading1"/>
         <w:pageBreakBefore/>
       </w:pPr>
-      <w:bookmarkStart w:id="112" w:name="_Toc244276203"/>
+      <w:bookmarkStart w:id="112" w:name="_Toc244278210"/>
       <w:r>
         <w:rPr>
           <w:rtl/>
@@ -58664,7 +58664,7 @@
       <w:pPr>
         <w:pStyle w:val="Heading2"/>
       </w:pPr>
-      <w:bookmarkStart w:id="113" w:name="_Toc244276204"/>
+      <w:bookmarkStart w:id="113" w:name="_Toc244278211"/>
       <w:r>
         <w:rPr>
           <w:rtl/>
@@ -59230,7 +59230,7 @@
       <w:pPr>
         <w:pStyle w:val="Heading2"/>
       </w:pPr>
-      <w:bookmarkStart w:id="114" w:name="_Toc244276205"/>
+      <w:bookmarkStart w:id="114" w:name="_Toc244278212"/>
       <w:r>
         <w:rPr>
           <w:rtl/>
@@ -59848,7 +59848,7 @@
         <w:pStyle w:val="Heading1"/>
         <w:pageBreakBefore/>
       </w:pPr>
-      <w:bookmarkStart w:id="115" w:name="_Toc244276206"/>
+      <w:bookmarkStart w:id="115" w:name="_Toc244278213"/>
       <w:r>
         <w:rPr>
           <w:rtl/>
@@ -61321,7 +61321,7 @@
         <w:pStyle w:val="Heading1"/>
         <w:pageBreakBefore/>
       </w:pPr>
-      <w:bookmarkStart w:id="116" w:name="_Toc244276207"/>
+      <w:bookmarkStart w:id="116" w:name="_Toc244278214"/>
       <w:r>
         <w:rPr>
           <w:rtl/>
@@ -62624,9 +62624,9 @@
 <file path=word/numbering.xml><?xml version="1.0" encoding="utf-8"?>
 <w:numbering xmlns:wpc="http://schemas.microsoft.com/office/word/2010/wordprocessingCanvas" xmlns:cx="http://schemas.microsoft.com/office/drawing/2014/chartex" xmlns:cx1="http://schemas.microsoft.com/office/drawing/2015/9/8/chartex" xmlns:cx2="http://schemas.microsoft.com/office/drawing/2015/10/21/chartex" xmlns:cx3="http://schemas.microsoft.com/office/drawing/2016/5/9/chartex" xmlns:cx4="http://schemas.microsoft.com/office/drawing/2016/5/10/chartex" xmlns:cx5="http://schemas.microsoft.com/office/drawing/2016/5/11/chartex" xmlns:cx6="http://schemas.microsoft.com/office/drawing/2016/5/12/chartex" xmlns:cx7="http://schemas.microsoft.com/office/drawing/2016/5/13/chartex" xmlns:cx8="http://schemas.microsoft.com/office/drawing/2016/5/14/chartex" xmlns:mc="http://schemas.openxmlformats.org/markup-compatibility/2006" xmlns:aink="http://schemas.microsoft.com/office/drawing/2016/ink" xmlns:am3d="http://schemas.microsoft.com/office/drawing/2017/model3d" xmlns:o="urn:schemas-microsoft-com:office:office" xmlns:oel="http://schemas.microsoft.com/office/2019/extlst" xmlns:r="http://schemas.openxmlformats.org/officeDocument/2006/relationships" xmlns:m="http://schemas.openxmlformats.org/officeDocument/2006/math" xmlns:v="urn:schemas-microsoft-com:vml" xmlns:wp14="http://schemas.microsoft.com/office/word/2010/wordprocessingDrawing" xmlns:wp="http://schemas.openxmlformats.org/drawingml/2006/wordprocessingDrawing" xmlns:w10="urn:schemas-microsoft-com:office:word" xmlns:w="http://schemas.openxmlformats.org/wordprocessingml/2006/main" xmlns:w14="http://schemas.microsoft.com/office/word/2010/wordml" xmlns:w15="http://schemas.microsoft.com/office/word/2012/wordml" xmlns:w16cex="http://schemas.microsoft.com/office/word/2018/wordml/cex" xmlns:w16cid="http://schemas.microsoft.com/office/word/2016/wordml/cid" xmlns:w16="http://schemas.microsoft.com/office/word/2018/wordml" xmlns:w16du="http://schemas.microsoft.com/office/word/2023/wordml/word16du" xmlns:w16sdtdh="http://schemas.microsoft.com/office/word/2020/wordml/sdtdatahash" xmlns:w16sdtfl="http://schemas.microsoft.com/office/word/2024/wordml/sdtformatlock" xmlns:w16se="http://schemas.microsoft.com/office/word/2015/wordml/symex" xmlns:wpg="http://schemas.microsoft.com/office/word/2010/wordprocessingGroup" xmlns:wpi="http://schemas.microsoft.com/office/word/2010/wordprocessingInk" xmlns:wne="http://schemas.microsoft.com/office/word/2006/wordml" xmlns:wps="http://schemas.microsoft.com/office/word/2010/wordprocessingShape" mc:Ignorable="w14 w15 w16se w16cid w16 w16cex w16sdtdh w16sdtfl w16du wp14">
   <w:abstractNum w:abstractNumId="0" w15:restartNumberingAfterBreak="0">
-    <w:nsid w:val="552703C3"/>
+    <w:nsid w:val="1D8C4918"/>
     <w:multiLevelType w:val="singleLevel"/>
-    <w:tmpl w:val="FD28881E"/>
+    <w:tmpl w:val="D5243D4C"/>
     <w:lvl w:ilvl="0">
       <w:start w:val="1"/>
       <w:numFmt w:val="decimal"/>
@@ -62646,9 +62646,9 @@
     </w:lvl>
   </w:abstractNum>
   <w:abstractNum w:abstractNumId="1" w15:restartNumberingAfterBreak="0">
-    <w:nsid w:val="6F962EC8"/>
+    <w:nsid w:val="2B517AAA"/>
     <w:multiLevelType w:val="singleLevel"/>
-    <w:tmpl w:val="7F7079CA"/>
+    <w:tmpl w:val="089CAB3A"/>
     <w:lvl w:ilvl="0">
       <w:start w:val="1"/>
       <w:numFmt w:val="bullet"/>
@@ -62664,34 +62664,34 @@
       </w:rPr>
     </w:lvl>
   </w:abstractNum>
-  <w:num w:numId="1" w16cid:durableId="1853765295">
+  <w:num w:numId="1" w16cid:durableId="1975862533">
     <w:abstractNumId w:val="1"/>
   </w:num>
-  <w:num w:numId="2" w16cid:durableId="160968712">
+  <w:num w:numId="2" w16cid:durableId="714892841">
     <w:abstractNumId w:val="0"/>
     <w:lvlOverride w:ilvl="0">
       <w:startOverride w:val="1"/>
     </w:lvlOverride>
   </w:num>
-  <w:num w:numId="3" w16cid:durableId="1899199027">
+  <w:num w:numId="3" w16cid:durableId="1362979112">
     <w:abstractNumId w:val="0"/>
     <w:lvlOverride w:ilvl="0">
       <w:startOverride w:val="1"/>
     </w:lvlOverride>
   </w:num>
-  <w:num w:numId="4" w16cid:durableId="1334842670">
+  <w:num w:numId="4" w16cid:durableId="1247377416">
     <w:abstractNumId w:val="0"/>
     <w:lvlOverride w:ilvl="0">
       <w:startOverride w:val="1"/>
     </w:lvlOverride>
   </w:num>
-  <w:num w:numId="5" w16cid:durableId="1470322026">
+  <w:num w:numId="5" w16cid:durableId="1436288339">
     <w:abstractNumId w:val="0"/>
     <w:lvlOverride w:ilvl="0">
       <w:startOverride w:val="1"/>
     </w:lvlOverride>
   </w:num>
-  <w:num w:numId="6" w16cid:durableId="521633687">
+  <w:num w:numId="6" w16cid:durableId="755902997">
     <w:abstractNumId w:val="0"/>
     <w:lvlOverride w:ilvl="0">
       <w:startOverride w:val="1"/>
@@ -63415,7 +63415,7 @@
     <w:autoRedefine/>
     <w:uiPriority w:val="39"/>
     <w:unhideWhenUsed/>
-    <w:rsid w:val="00357C29"/>
+    <w:rsid w:val="00A2693E"/>
     <w:pPr>
       <w:bidi w:val="0"/>
       <w:spacing w:after="100" w:line="278" w:lineRule="auto"/>
@@ -63439,7 +63439,7 @@
     <w:autoRedefine/>
     <w:uiPriority w:val="39"/>
     <w:unhideWhenUsed/>
-    <w:rsid w:val="00357C29"/>
+    <w:rsid w:val="00A2693E"/>
     <w:pPr>
       <w:bidi w:val="0"/>
       <w:spacing w:after="100" w:line="278" w:lineRule="auto"/>
@@ -63463,7 +63463,7 @@
     <w:autoRedefine/>
     <w:uiPriority w:val="39"/>
     <w:unhideWhenUsed/>
-    <w:rsid w:val="00357C29"/>
+    <w:rsid w:val="00A2693E"/>
     <w:pPr>
       <w:bidi w:val="0"/>
       <w:spacing w:after="100" w:line="278" w:lineRule="auto"/>
@@ -63487,7 +63487,7 @@
     <w:autoRedefine/>
     <w:uiPriority w:val="39"/>
     <w:unhideWhenUsed/>
-    <w:rsid w:val="00357C29"/>
+    <w:rsid w:val="00A2693E"/>
     <w:pPr>
       <w:bidi w:val="0"/>
       <w:spacing w:after="100" w:line="278" w:lineRule="auto"/>
@@ -63511,7 +63511,7 @@
     <w:autoRedefine/>
     <w:uiPriority w:val="39"/>
     <w:unhideWhenUsed/>
-    <w:rsid w:val="00357C29"/>
+    <w:rsid w:val="00A2693E"/>
     <w:pPr>
       <w:bidi w:val="0"/>
       <w:spacing w:after="100" w:line="278" w:lineRule="auto"/>
@@ -63535,7 +63535,7 @@
     <w:autoRedefine/>
     <w:uiPriority w:val="39"/>
     <w:unhideWhenUsed/>
-    <w:rsid w:val="00357C29"/>
+    <w:rsid w:val="00A2693E"/>
     <w:pPr>
       <w:bidi w:val="0"/>
       <w:spacing w:after="100" w:line="278" w:lineRule="auto"/>
@@ -63559,7 +63559,7 @@
     <w:autoRedefine/>
     <w:uiPriority w:val="39"/>
     <w:unhideWhenUsed/>
-    <w:rsid w:val="00357C29"/>
+    <w:rsid w:val="00A2693E"/>
     <w:pPr>
       <w:bidi w:val="0"/>
       <w:spacing w:after="100" w:line="278" w:lineRule="auto"/>
@@ -63581,7 +63581,7 @@
     <w:basedOn w:val="DefaultParagraphFont"/>
     <w:uiPriority w:val="99"/>
     <w:unhideWhenUsed/>
-    <w:rsid w:val="00357C29"/>
+    <w:rsid w:val="00A2693E"/>
     <w:rPr>
       <w:color w:val="467886" w:themeColor="hyperlink"/>
       <w:u w:val="single"/>
@@ -63593,7 +63593,7 @@
     <w:uiPriority w:val="99"/>
     <w:semiHidden/>
     <w:unhideWhenUsed/>
-    <w:rsid w:val="00357C29"/>
+    <w:rsid w:val="00A2693E"/>
     <w:rPr>
       <w:color w:val="605E5C"/>
       <w:shd w:val="clear" w:color="auto" w:fill="E1DFDD"/>

</xml_diff>